<commit_message>
Update report for presentation
</commit_message>
<xml_diff>
--- a/Report/Report.docx
+++ b/Report/Report.docx
@@ -38,20 +38,32 @@
               <w:rPr>
                 <w:rFonts w:ascii="Times New Roman" w:eastAsia="Times New Roman" w:hAnsi="Times New Roman" w:cs="Times New Roman"/>
                 <w:kern w:val="0"/>
-                <w:sz w:val="22"/>
-                <w:szCs w:val="22"/>
                 <w14:ligatures w14:val="none"/>
+                <w:rPrChange w:id="0" w:author="HP" w:date="2026-03-20T14:55:00Z">
+                  <w:rPr>
+                    <w:rFonts w:ascii="Times New Roman" w:eastAsia="Times New Roman" w:hAnsi="Times New Roman" w:cs="Times New Roman"/>
+                    <w:kern w:val="0"/>
+                    <w:sz w:val="22"/>
+                    <w:szCs w:val="22"/>
+                    <w14:ligatures w14:val="none"/>
+                  </w:rPr>
+                </w:rPrChange>
               </w:rPr>
             </w:pPr>
-            <w:bookmarkStart w:id="0" w:name="_GoBack"/>
-            <w:bookmarkEnd w:id="0"/>
             <w:r>
               <w:rPr>
                 <w:rFonts w:ascii="Times New Roman" w:eastAsia="Times New Roman" w:hAnsi="Times New Roman" w:cs="Times New Roman"/>
                 <w:kern w:val="0"/>
-                <w:sz w:val="22"/>
-                <w:szCs w:val="22"/>
                 <w14:ligatures w14:val="none"/>
+                <w:rPrChange w:id="1" w:author="HP" w:date="2026-03-20T14:55:00Z">
+                  <w:rPr>
+                    <w:rFonts w:ascii="Times New Roman" w:eastAsia="Times New Roman" w:hAnsi="Times New Roman" w:cs="Times New Roman"/>
+                    <w:kern w:val="0"/>
+                    <w:sz w:val="22"/>
+                    <w:szCs w:val="22"/>
+                    <w14:ligatures w14:val="none"/>
+                  </w:rPr>
+                </w:rPrChange>
               </w:rPr>
               <w:t>HOCHIMINH CITY UNIVERSITY OF TECHNOLOGY</w:t>
             </w:r>
@@ -69,18 +81,32 @@
               <w:rPr>
                 <w:rFonts w:ascii="Times New Roman" w:eastAsia="Times New Roman" w:hAnsi="Times New Roman" w:cs="Times New Roman"/>
                 <w:kern w:val="0"/>
-                <w:sz w:val="22"/>
-                <w:szCs w:val="22"/>
                 <w14:ligatures w14:val="none"/>
+                <w:rPrChange w:id="2" w:author="HP" w:date="2026-03-20T14:55:00Z">
+                  <w:rPr>
+                    <w:rFonts w:ascii="Times New Roman" w:eastAsia="Times New Roman" w:hAnsi="Times New Roman" w:cs="Times New Roman"/>
+                    <w:kern w:val="0"/>
+                    <w:sz w:val="22"/>
+                    <w:szCs w:val="22"/>
+                    <w14:ligatures w14:val="none"/>
+                  </w:rPr>
+                </w:rPrChange>
               </w:rPr>
             </w:pPr>
             <w:r>
               <w:rPr>
                 <w:rFonts w:ascii="Times New Roman" w:eastAsia="Times New Roman" w:hAnsi="Times New Roman" w:cs="Times New Roman"/>
                 <w:kern w:val="0"/>
-                <w:sz w:val="22"/>
-                <w:szCs w:val="22"/>
                 <w14:ligatures w14:val="none"/>
+                <w:rPrChange w:id="3" w:author="HP" w:date="2026-03-20T14:55:00Z">
+                  <w:rPr>
+                    <w:rFonts w:ascii="Times New Roman" w:eastAsia="Times New Roman" w:hAnsi="Times New Roman" w:cs="Times New Roman"/>
+                    <w:kern w:val="0"/>
+                    <w:sz w:val="22"/>
+                    <w:szCs w:val="22"/>
+                    <w14:ligatures w14:val="none"/>
+                  </w:rPr>
+                </w:rPrChange>
               </w:rPr>
               <w:t>SOCIALIST REPUBLIC OF VIETNAM</w:t>
             </w:r>
@@ -104,9 +130,18 @@
                 <w:b/>
                 <w:bCs/>
                 <w:kern w:val="0"/>
-                <w:sz w:val="22"/>
-                <w:szCs w:val="22"/>
                 <w14:ligatures w14:val="none"/>
+                <w:rPrChange w:id="4" w:author="HP" w:date="2026-03-20T14:55:00Z">
+                  <w:rPr>
+                    <w:rFonts w:ascii="Times New Roman" w:eastAsia="Times New Roman" w:hAnsi="Times New Roman" w:cs="Times New Roman"/>
+                    <w:b/>
+                    <w:bCs/>
+                    <w:kern w:val="0"/>
+                    <w:sz w:val="22"/>
+                    <w:szCs w:val="22"/>
+                    <w14:ligatures w14:val="none"/>
+                  </w:rPr>
+                </w:rPrChange>
               </w:rPr>
             </w:pPr>
             <w:r>
@@ -115,9 +150,18 @@
                 <w:b/>
                 <w:bCs/>
                 <w:kern w:val="0"/>
-                <w:sz w:val="22"/>
-                <w:szCs w:val="22"/>
                 <w14:ligatures w14:val="none"/>
+                <w:rPrChange w:id="5" w:author="HP" w:date="2026-03-20T14:55:00Z">
+                  <w:rPr>
+                    <w:rFonts w:ascii="Times New Roman" w:eastAsia="Times New Roman" w:hAnsi="Times New Roman" w:cs="Times New Roman"/>
+                    <w:b/>
+                    <w:bCs/>
+                    <w:kern w:val="0"/>
+                    <w:sz w:val="22"/>
+                    <w:szCs w:val="22"/>
+                    <w14:ligatures w14:val="none"/>
+                  </w:rPr>
+                </w:rPrChange>
               </w:rPr>
               <w:t>INSTITUTE OF INTERNATIONAL EDUCATION</w:t>
             </w:r>
@@ -136,18 +180,32 @@
               <w:rPr>
                 <w:rFonts w:ascii="Times New Roman" w:eastAsia="Times New Roman" w:hAnsi="Times New Roman" w:cs="Times New Roman"/>
                 <w:kern w:val="0"/>
-                <w:sz w:val="22"/>
-                <w:szCs w:val="22"/>
                 <w14:ligatures w14:val="none"/>
+                <w:rPrChange w:id="6" w:author="HP" w:date="2026-03-20T14:55:00Z">
+                  <w:rPr>
+                    <w:rFonts w:ascii="Times New Roman" w:eastAsia="Times New Roman" w:hAnsi="Times New Roman" w:cs="Times New Roman"/>
+                    <w:kern w:val="0"/>
+                    <w:sz w:val="22"/>
+                    <w:szCs w:val="22"/>
+                    <w14:ligatures w14:val="none"/>
+                  </w:rPr>
+                </w:rPrChange>
               </w:rPr>
             </w:pPr>
             <w:r>
               <w:rPr>
                 <w:rFonts w:ascii="Times New Roman" w:eastAsia="Times New Roman" w:hAnsi="Times New Roman" w:cs="Times New Roman"/>
                 <w:kern w:val="0"/>
-                <w:sz w:val="22"/>
-                <w:szCs w:val="22"/>
                 <w14:ligatures w14:val="none"/>
+                <w:rPrChange w:id="7" w:author="HP" w:date="2026-03-20T14:55:00Z">
+                  <w:rPr>
+                    <w:rFonts w:ascii="Times New Roman" w:eastAsia="Times New Roman" w:hAnsi="Times New Roman" w:cs="Times New Roman"/>
+                    <w:kern w:val="0"/>
+                    <w:sz w:val="22"/>
+                    <w:szCs w:val="22"/>
+                    <w14:ligatures w14:val="none"/>
+                  </w:rPr>
+                </w:rPrChange>
               </w:rPr>
               <w:t>Independence - Freedom – Happiness</w:t>
             </w:r>
@@ -160,6 +218,11 @@
         <w:spacing w:before="0" w:after="0"/>
         <w:rPr>
           <w:rFonts w:ascii="Times New Roman" w:hAnsi="Times New Roman" w:cs="Times New Roman"/>
+          <w:rPrChange w:id="8" w:author="HP" w:date="2026-03-20T14:55:00Z">
+            <w:rPr>
+              <w:rFonts w:ascii="Times New Roman" w:hAnsi="Times New Roman" w:cs="Times New Roman"/>
+            </w:rPr>
+          </w:rPrChange>
         </w:rPr>
       </w:pPr>
     </w:p>
@@ -169,6 +232,12 @@
         <w:rPr>
           <w:rFonts w:ascii="Times New Roman" w:hAnsi="Times New Roman" w:cs="Times New Roman"/>
           <w:b/>
+          <w:rPrChange w:id="9" w:author="HP" w:date="2026-03-20T14:55:00Z">
+            <w:rPr>
+              <w:rFonts w:ascii="Times New Roman" w:hAnsi="Times New Roman" w:cs="Times New Roman"/>
+              <w:b/>
+            </w:rPr>
+          </w:rPrChange>
         </w:rPr>
       </w:pPr>
     </w:p>
@@ -178,6 +247,12 @@
         <w:rPr>
           <w:rFonts w:ascii="Times New Roman" w:hAnsi="Times New Roman" w:cs="Times New Roman"/>
           <w:b/>
+          <w:rPrChange w:id="10" w:author="HP" w:date="2026-03-20T14:55:00Z">
+            <w:rPr>
+              <w:rFonts w:ascii="Times New Roman" w:hAnsi="Times New Roman" w:cs="Times New Roman"/>
+              <w:b/>
+            </w:rPr>
+          </w:rPrChange>
         </w:rPr>
       </w:pPr>
     </w:p>
@@ -187,6 +262,12 @@
         <w:rPr>
           <w:rFonts w:ascii="Times New Roman" w:hAnsi="Times New Roman" w:cs="Times New Roman"/>
           <w:b/>
+          <w:rPrChange w:id="11" w:author="HP" w:date="2026-03-20T14:55:00Z">
+            <w:rPr>
+              <w:rFonts w:ascii="Times New Roman" w:hAnsi="Times New Roman" w:cs="Times New Roman"/>
+              <w:b/>
+            </w:rPr>
+          </w:rPrChange>
         </w:rPr>
       </w:pPr>
     </w:p>
@@ -196,6 +277,12 @@
         <w:rPr>
           <w:rFonts w:ascii="Times New Roman" w:hAnsi="Times New Roman" w:cs="Times New Roman"/>
           <w:b/>
+          <w:rPrChange w:id="12" w:author="HP" w:date="2026-03-20T14:55:00Z">
+            <w:rPr>
+              <w:rFonts w:ascii="Times New Roman" w:hAnsi="Times New Roman" w:cs="Times New Roman"/>
+              <w:b/>
+            </w:rPr>
+          </w:rPrChange>
         </w:rPr>
       </w:pPr>
     </w:p>
@@ -205,6 +292,12 @@
         <w:rPr>
           <w:rFonts w:ascii="Times New Roman" w:hAnsi="Times New Roman" w:cs="Times New Roman"/>
           <w:b/>
+          <w:rPrChange w:id="13" w:author="HP" w:date="2026-03-20T14:55:00Z">
+            <w:rPr>
+              <w:rFonts w:ascii="Times New Roman" w:hAnsi="Times New Roman" w:cs="Times New Roman"/>
+              <w:b/>
+            </w:rPr>
+          </w:rPrChange>
         </w:rPr>
       </w:pPr>
     </w:p>
@@ -214,6 +307,12 @@
         <w:rPr>
           <w:rFonts w:ascii="Times New Roman" w:hAnsi="Times New Roman" w:cs="Times New Roman"/>
           <w:b/>
+          <w:rPrChange w:id="14" w:author="HP" w:date="2026-03-20T14:55:00Z">
+            <w:rPr>
+              <w:rFonts w:ascii="Times New Roman" w:hAnsi="Times New Roman" w:cs="Times New Roman"/>
+              <w:b/>
+            </w:rPr>
+          </w:rPrChange>
         </w:rPr>
       </w:pPr>
     </w:p>
@@ -223,6 +322,12 @@
         <w:rPr>
           <w:rFonts w:ascii="Times New Roman" w:hAnsi="Times New Roman" w:cs="Times New Roman"/>
           <w:b/>
+          <w:rPrChange w:id="15" w:author="HP" w:date="2026-03-20T14:55:00Z">
+            <w:rPr>
+              <w:rFonts w:ascii="Times New Roman" w:hAnsi="Times New Roman" w:cs="Times New Roman"/>
+              <w:b/>
+            </w:rPr>
+          </w:rPrChange>
         </w:rPr>
       </w:pPr>
     </w:p>
@@ -232,6 +337,12 @@
         <w:rPr>
           <w:rFonts w:ascii="Times New Roman" w:hAnsi="Times New Roman" w:cs="Times New Roman"/>
           <w:b/>
+          <w:rPrChange w:id="16" w:author="HP" w:date="2026-03-20T14:55:00Z">
+            <w:rPr>
+              <w:rFonts w:ascii="Times New Roman" w:hAnsi="Times New Roman" w:cs="Times New Roman"/>
+              <w:b/>
+            </w:rPr>
+          </w:rPrChange>
         </w:rPr>
       </w:pPr>
     </w:p>
@@ -241,6 +352,12 @@
         <w:rPr>
           <w:rFonts w:ascii="Times New Roman" w:hAnsi="Times New Roman" w:cs="Times New Roman"/>
           <w:b/>
+          <w:rPrChange w:id="17" w:author="HP" w:date="2026-03-20T14:55:00Z">
+            <w:rPr>
+              <w:rFonts w:ascii="Times New Roman" w:hAnsi="Times New Roman" w:cs="Times New Roman"/>
+              <w:b/>
+            </w:rPr>
+          </w:rPrChange>
         </w:rPr>
       </w:pPr>
     </w:p>
@@ -250,6 +367,12 @@
         <w:rPr>
           <w:rFonts w:ascii="Times New Roman" w:hAnsi="Times New Roman" w:cs="Times New Roman"/>
           <w:b/>
+          <w:rPrChange w:id="18" w:author="HP" w:date="2026-03-20T14:55:00Z">
+            <w:rPr>
+              <w:rFonts w:ascii="Times New Roman" w:hAnsi="Times New Roman" w:cs="Times New Roman"/>
+              <w:b/>
+            </w:rPr>
+          </w:rPrChange>
         </w:rPr>
       </w:pPr>
     </w:p>
@@ -259,6 +382,12 @@
         <w:rPr>
           <w:rFonts w:ascii="Times New Roman" w:hAnsi="Times New Roman" w:cs="Times New Roman"/>
           <w:b/>
+          <w:rPrChange w:id="19" w:author="HP" w:date="2026-03-20T14:55:00Z">
+            <w:rPr>
+              <w:rFonts w:ascii="Times New Roman" w:hAnsi="Times New Roman" w:cs="Times New Roman"/>
+              <w:b/>
+            </w:rPr>
+          </w:rPrChange>
         </w:rPr>
       </w:pPr>
     </w:p>
@@ -268,6 +397,12 @@
         <w:rPr>
           <w:rFonts w:ascii="Times New Roman" w:hAnsi="Times New Roman" w:cs="Times New Roman"/>
           <w:b/>
+          <w:rPrChange w:id="20" w:author="HP" w:date="2026-03-20T14:55:00Z">
+            <w:rPr>
+              <w:rFonts w:ascii="Times New Roman" w:hAnsi="Times New Roman" w:cs="Times New Roman"/>
+              <w:b/>
+            </w:rPr>
+          </w:rPrChange>
         </w:rPr>
       </w:pPr>
     </w:p>
@@ -278,7 +413,13 @@
         <w:rPr>
           <w:rFonts w:ascii="Times New Roman" w:hAnsi="Times New Roman" w:cs="Times New Roman"/>
           <w:b/>
-          <w:sz w:val="32"/>
+          <w:rPrChange w:id="21" w:author="HP" w:date="2026-03-20T14:55:00Z">
+            <w:rPr>
+              <w:rFonts w:ascii="Times New Roman" w:hAnsi="Times New Roman" w:cs="Times New Roman"/>
+              <w:b/>
+              <w:sz w:val="32"/>
+            </w:rPr>
+          </w:rPrChange>
         </w:rPr>
       </w:pPr>
     </w:p>
@@ -289,14 +430,26 @@
         <w:rPr>
           <w:rFonts w:ascii="Times New Roman" w:hAnsi="Times New Roman" w:cs="Times New Roman"/>
           <w:b/>
-          <w:sz w:val="32"/>
+          <w:rPrChange w:id="22" w:author="HP" w:date="2026-03-20T14:55:00Z">
+            <w:rPr>
+              <w:rFonts w:ascii="Times New Roman" w:hAnsi="Times New Roman" w:cs="Times New Roman"/>
+              <w:b/>
+              <w:sz w:val="32"/>
+            </w:rPr>
+          </w:rPrChange>
         </w:rPr>
       </w:pPr>
       <w:r>
         <w:rPr>
           <w:rFonts w:ascii="Times New Roman" w:hAnsi="Times New Roman" w:cs="Times New Roman"/>
           <w:b/>
-          <w:sz w:val="32"/>
+          <w:rPrChange w:id="23" w:author="HP" w:date="2026-03-20T14:55:00Z">
+            <w:rPr>
+              <w:rFonts w:ascii="Times New Roman" w:hAnsi="Times New Roman" w:cs="Times New Roman"/>
+              <w:b/>
+              <w:sz w:val="32"/>
+            </w:rPr>
+          </w:rPrChange>
         </w:rPr>
         <w:t>REPORT</w:t>
       </w:r>
@@ -308,7 +461,13 @@
         <w:rPr>
           <w:rFonts w:ascii="Times New Roman" w:hAnsi="Times New Roman" w:cs="Times New Roman"/>
           <w:b/>
-          <w:sz w:val="32"/>
+          <w:rPrChange w:id="24" w:author="HP" w:date="2026-03-20T14:55:00Z">
+            <w:rPr>
+              <w:rFonts w:ascii="Times New Roman" w:hAnsi="Times New Roman" w:cs="Times New Roman"/>
+              <w:b/>
+              <w:sz w:val="32"/>
+            </w:rPr>
+          </w:rPrChange>
         </w:rPr>
       </w:pPr>
     </w:p>
@@ -319,14 +478,26 @@
         <w:rPr>
           <w:rFonts w:ascii="Times New Roman" w:hAnsi="Times New Roman" w:cs="Times New Roman"/>
           <w:b/>
-          <w:sz w:val="32"/>
+          <w:rPrChange w:id="25" w:author="HP" w:date="2026-03-20T14:55:00Z">
+            <w:rPr>
+              <w:rFonts w:ascii="Times New Roman" w:hAnsi="Times New Roman" w:cs="Times New Roman"/>
+              <w:b/>
+              <w:sz w:val="32"/>
+            </w:rPr>
+          </w:rPrChange>
         </w:rPr>
       </w:pPr>
       <w:r>
         <w:rPr>
           <w:rFonts w:ascii="Times New Roman" w:hAnsi="Times New Roman" w:cs="Times New Roman"/>
           <w:b/>
-          <w:sz w:val="32"/>
+          <w:rPrChange w:id="26" w:author="HP" w:date="2026-03-20T14:55:00Z">
+            <w:rPr>
+              <w:rFonts w:ascii="Times New Roman" w:hAnsi="Times New Roman" w:cs="Times New Roman"/>
+              <w:b/>
+              <w:sz w:val="32"/>
+            </w:rPr>
+          </w:rPrChange>
         </w:rPr>
         <w:t xml:space="preserve">Week 01 : Development Environment &amp; UI </w:t>
       </w:r>
@@ -338,24 +509,28 @@
         <w:rPr>
           <w:rFonts w:ascii="Times New Roman" w:hAnsi="Times New Roman" w:cs="Times New Roman"/>
           <w:b/>
-          <w:sz w:val="32"/>
+          <w:rPrChange w:id="27" w:author="HP" w:date="2026-03-20T14:55:00Z">
+            <w:rPr>
+              <w:rFonts w:ascii="Times New Roman" w:hAnsi="Times New Roman" w:cs="Times New Roman"/>
+              <w:b/>
+              <w:sz w:val="32"/>
+            </w:rPr>
+          </w:rPrChange>
         </w:rPr>
       </w:pPr>
       <w:r>
         <w:rPr>
           <w:rFonts w:ascii="Times New Roman" w:hAnsi="Times New Roman" w:cs="Times New Roman"/>
           <w:b/>
-          <w:sz w:val="32"/>
-        </w:rPr>
-        <w:t xml:space="preserve">Course: </w:t>
-      </w:r>
-      <w:r>
-        <w:rPr>
-          <w:rFonts w:ascii="Times New Roman" w:hAnsi="Times New Roman" w:cs="Times New Roman"/>
-          <w:b/>
-          <w:sz w:val="32"/>
-        </w:rPr>
-        <w:t>Basic Project</w:t>
+          <w:rPrChange w:id="28" w:author="HP" w:date="2026-03-20T14:55:00Z">
+            <w:rPr>
+              <w:rFonts w:ascii="Times New Roman" w:hAnsi="Times New Roman" w:cs="Times New Roman"/>
+              <w:b/>
+              <w:sz w:val="32"/>
+            </w:rPr>
+          </w:rPrChange>
+        </w:rPr>
+        <w:t>Course: Basic Project</w:t>
       </w:r>
     </w:p>
     <w:p>
@@ -365,7 +540,13 @@
         <w:rPr>
           <w:rFonts w:ascii="Times New Roman" w:hAnsi="Times New Roman" w:cs="Times New Roman"/>
           <w:b/>
-          <w:sz w:val="32"/>
+          <w:rPrChange w:id="29" w:author="HP" w:date="2026-03-20T14:55:00Z">
+            <w:rPr>
+              <w:rFonts w:ascii="Times New Roman" w:hAnsi="Times New Roman" w:cs="Times New Roman"/>
+              <w:b/>
+              <w:sz w:val="32"/>
+            </w:rPr>
+          </w:rPrChange>
         </w:rPr>
       </w:pPr>
     </w:p>
@@ -376,7 +557,13 @@
         <w:rPr>
           <w:rFonts w:ascii="Times New Roman" w:hAnsi="Times New Roman" w:cs="Times New Roman"/>
           <w:b/>
-          <w:sz w:val="32"/>
+          <w:rPrChange w:id="30" w:author="HP" w:date="2026-03-20T14:55:00Z">
+            <w:rPr>
+              <w:rFonts w:ascii="Times New Roman" w:hAnsi="Times New Roman" w:cs="Times New Roman"/>
+              <w:b/>
+              <w:sz w:val="32"/>
+            </w:rPr>
+          </w:rPrChange>
         </w:rPr>
       </w:pPr>
     </w:p>
@@ -387,7 +574,13 @@
         <w:rPr>
           <w:rFonts w:ascii="Times New Roman" w:hAnsi="Times New Roman" w:cs="Times New Roman"/>
           <w:b/>
-          <w:sz w:val="32"/>
+          <w:rPrChange w:id="31" w:author="HP" w:date="2026-03-20T14:55:00Z">
+            <w:rPr>
+              <w:rFonts w:ascii="Times New Roman" w:hAnsi="Times New Roman" w:cs="Times New Roman"/>
+              <w:b/>
+              <w:sz w:val="32"/>
+            </w:rPr>
+          </w:rPrChange>
         </w:rPr>
       </w:pPr>
     </w:p>
@@ -397,7 +590,13 @@
         <w:rPr>
           <w:rFonts w:ascii="Times New Roman" w:hAnsi="Times New Roman" w:cs="Times New Roman"/>
           <w:b/>
-          <w:sz w:val="32"/>
+          <w:rPrChange w:id="32" w:author="HP" w:date="2026-03-20T14:55:00Z">
+            <w:rPr>
+              <w:rFonts w:ascii="Times New Roman" w:hAnsi="Times New Roman" w:cs="Times New Roman"/>
+              <w:b/>
+              <w:sz w:val="32"/>
+            </w:rPr>
+          </w:rPrChange>
         </w:rPr>
       </w:pPr>
     </w:p>
@@ -407,7 +606,13 @@
         <w:rPr>
           <w:rFonts w:ascii="Times New Roman" w:hAnsi="Times New Roman" w:cs="Times New Roman"/>
           <w:b/>
-          <w:sz w:val="32"/>
+          <w:rPrChange w:id="33" w:author="HP" w:date="2026-03-20T14:55:00Z">
+            <w:rPr>
+              <w:rFonts w:ascii="Times New Roman" w:hAnsi="Times New Roman" w:cs="Times New Roman"/>
+              <w:b/>
+              <w:sz w:val="32"/>
+            </w:rPr>
+          </w:rPrChange>
         </w:rPr>
       </w:pPr>
     </w:p>
@@ -417,7 +622,13 @@
         <w:rPr>
           <w:rFonts w:ascii="Times New Roman" w:hAnsi="Times New Roman" w:cs="Times New Roman"/>
           <w:b/>
-          <w:sz w:val="32"/>
+          <w:rPrChange w:id="34" w:author="HP" w:date="2026-03-20T14:55:00Z">
+            <w:rPr>
+              <w:rFonts w:ascii="Times New Roman" w:hAnsi="Times New Roman" w:cs="Times New Roman"/>
+              <w:b/>
+              <w:sz w:val="32"/>
+            </w:rPr>
+          </w:rPrChange>
         </w:rPr>
       </w:pPr>
     </w:p>
@@ -427,7 +638,13 @@
         <w:rPr>
           <w:rFonts w:ascii="Times New Roman" w:hAnsi="Times New Roman" w:cs="Times New Roman"/>
           <w:b/>
-          <w:sz w:val="32"/>
+          <w:rPrChange w:id="35" w:author="HP" w:date="2026-03-20T14:55:00Z">
+            <w:rPr>
+              <w:rFonts w:ascii="Times New Roman" w:hAnsi="Times New Roman" w:cs="Times New Roman"/>
+              <w:b/>
+              <w:sz w:val="32"/>
+            </w:rPr>
+          </w:rPrChange>
         </w:rPr>
       </w:pPr>
     </w:p>
@@ -437,7 +654,13 @@
         <w:rPr>
           <w:rFonts w:ascii="Times New Roman" w:hAnsi="Times New Roman" w:cs="Times New Roman"/>
           <w:b/>
-          <w:sz w:val="32"/>
+          <w:rPrChange w:id="36" w:author="HP" w:date="2026-03-20T14:55:00Z">
+            <w:rPr>
+              <w:rFonts w:ascii="Times New Roman" w:hAnsi="Times New Roman" w:cs="Times New Roman"/>
+              <w:b/>
+              <w:sz w:val="32"/>
+            </w:rPr>
+          </w:rPrChange>
         </w:rPr>
       </w:pPr>
     </w:p>
@@ -447,84 +670,129 @@
         <w:rPr>
           <w:rFonts w:ascii="Times New Roman" w:hAnsi="Times New Roman" w:cs="Times New Roman"/>
           <w:b/>
-          <w:sz w:val="32"/>
+          <w:rPrChange w:id="37" w:author="HP" w:date="2026-03-20T14:55:00Z">
+            <w:rPr>
+              <w:rFonts w:ascii="Times New Roman" w:hAnsi="Times New Roman" w:cs="Times New Roman"/>
+              <w:b/>
+              <w:sz w:val="32"/>
+            </w:rPr>
+          </w:rPrChange>
         </w:rPr>
       </w:pPr>
       <w:r>
         <w:rPr>
           <w:rFonts w:ascii="Times New Roman" w:hAnsi="Times New Roman" w:cs="Times New Roman"/>
           <w:b/>
-          <w:sz w:val="32"/>
-        </w:rPr>
-        <w:t>Lecturer : Dr</w:t>
+          <w:rPrChange w:id="38" w:author="HP" w:date="2026-03-20T14:55:00Z">
+            <w:rPr>
+              <w:rFonts w:ascii="Times New Roman" w:hAnsi="Times New Roman" w:cs="Times New Roman"/>
+              <w:b/>
+              <w:sz w:val="32"/>
+            </w:rPr>
+          </w:rPrChange>
+        </w:rPr>
+        <w:t>Lecturer : Dr. Le Thi Ngoc Tho</w:t>
       </w:r>
+    </w:p>
+    <w:p>
+      <w:pPr>
+        <w:spacing w:before="0" w:after="0"/>
+        <w:rPr>
+          <w:rFonts w:ascii="Times New Roman" w:hAnsi="Times New Roman" w:cs="Times New Roman"/>
+          <w:b/>
+          <w:rPrChange w:id="39" w:author="HP" w:date="2026-03-20T14:55:00Z">
+            <w:rPr>
+              <w:rFonts w:ascii="Times New Roman" w:hAnsi="Times New Roman" w:cs="Times New Roman"/>
+              <w:b/>
+              <w:sz w:val="32"/>
+            </w:rPr>
+          </w:rPrChange>
+        </w:rPr>
+      </w:pPr>
+    </w:p>
+    <w:p>
+      <w:pPr>
+        <w:spacing w:before="0" w:after="0"/>
+        <w:rPr>
+          <w:rFonts w:ascii="Times New Roman" w:hAnsi="Times New Roman" w:cs="Times New Roman"/>
+          <w:b/>
+          <w:rPrChange w:id="40" w:author="HP" w:date="2026-03-20T14:55:00Z">
+            <w:rPr>
+              <w:rFonts w:ascii="Times New Roman" w:hAnsi="Times New Roman" w:cs="Times New Roman"/>
+              <w:b/>
+              <w:sz w:val="32"/>
+            </w:rPr>
+          </w:rPrChange>
+        </w:rPr>
+      </w:pPr>
+    </w:p>
+    <w:p>
+      <w:pPr>
+        <w:spacing w:before="0" w:after="0"/>
+        <w:rPr>
+          <w:rFonts w:ascii="Times New Roman" w:hAnsi="Times New Roman" w:cs="Times New Roman"/>
+          <w:b/>
+          <w:rPrChange w:id="41" w:author="HP" w:date="2026-03-20T14:55:00Z">
+            <w:rPr>
+              <w:rFonts w:ascii="Times New Roman" w:hAnsi="Times New Roman" w:cs="Times New Roman"/>
+              <w:b/>
+              <w:sz w:val="32"/>
+            </w:rPr>
+          </w:rPrChange>
+        </w:rPr>
+      </w:pPr>
+    </w:p>
+    <w:p>
+      <w:pPr>
+        <w:spacing w:before="0" w:after="0"/>
+        <w:rPr>
+          <w:rFonts w:ascii="Times New Roman" w:hAnsi="Times New Roman" w:cs="Times New Roman"/>
+          <w:b/>
+          <w:rPrChange w:id="42" w:author="HP" w:date="2026-03-20T14:55:00Z">
+            <w:rPr>
+              <w:rFonts w:ascii="Times New Roman" w:hAnsi="Times New Roman" w:cs="Times New Roman"/>
+              <w:b/>
+              <w:sz w:val="32"/>
+            </w:rPr>
+          </w:rPrChange>
+        </w:rPr>
+      </w:pPr>
+    </w:p>
+    <w:p>
+      <w:pPr>
+        <w:spacing w:before="0" w:after="0"/>
+        <w:rPr>
+          <w:rFonts w:ascii="Times New Roman" w:hAnsi="Times New Roman" w:cs="Times New Roman"/>
+          <w:b/>
+          <w:rPrChange w:id="43" w:author="HP" w:date="2026-03-20T14:55:00Z">
+            <w:rPr>
+              <w:rFonts w:ascii="Times New Roman" w:hAnsi="Times New Roman" w:cs="Times New Roman"/>
+              <w:b/>
+            </w:rPr>
+          </w:rPrChange>
+        </w:rPr>
+      </w:pPr>
       <w:r>
         <w:rPr>
           <w:rFonts w:ascii="Times New Roman" w:hAnsi="Times New Roman" w:cs="Times New Roman"/>
           <w:b/>
-          <w:sz w:val="32"/>
-        </w:rPr>
-        <w:t>. Le Thi Ngoc Tho</w:t>
-      </w:r>
-    </w:p>
-    <w:p>
-      <w:pPr>
-        <w:spacing w:before="0" w:after="0"/>
-        <w:rPr>
-          <w:rFonts w:ascii="Times New Roman" w:hAnsi="Times New Roman" w:cs="Times New Roman"/>
-          <w:b/>
-          <w:sz w:val="32"/>
-        </w:rPr>
-      </w:pPr>
-    </w:p>
-    <w:p>
-      <w:pPr>
-        <w:spacing w:before="0" w:after="0"/>
-        <w:rPr>
-          <w:rFonts w:ascii="Times New Roman" w:hAnsi="Times New Roman" w:cs="Times New Roman"/>
-          <w:b/>
-          <w:sz w:val="32"/>
-        </w:rPr>
-      </w:pPr>
-    </w:p>
-    <w:p>
-      <w:pPr>
-        <w:spacing w:before="0" w:after="0"/>
-        <w:rPr>
-          <w:rFonts w:ascii="Times New Roman" w:hAnsi="Times New Roman" w:cs="Times New Roman"/>
-          <w:b/>
-          <w:sz w:val="32"/>
-        </w:rPr>
-      </w:pPr>
-    </w:p>
-    <w:p>
-      <w:pPr>
-        <w:spacing w:before="0" w:after="0"/>
-        <w:rPr>
-          <w:rFonts w:ascii="Times New Roman" w:hAnsi="Times New Roman" w:cs="Times New Roman"/>
-          <w:b/>
-          <w:sz w:val="32"/>
-        </w:rPr>
-      </w:pPr>
-    </w:p>
-    <w:p>
-      <w:pPr>
-        <w:spacing w:before="0" w:after="0"/>
-        <w:rPr>
-          <w:rFonts w:ascii="Times New Roman" w:hAnsi="Times New Roman" w:cs="Times New Roman"/>
-          <w:b/>
-        </w:rPr>
-      </w:pPr>
-      <w:r>
-        <w:rPr>
-          <w:rFonts w:ascii="Times New Roman" w:hAnsi="Times New Roman" w:cs="Times New Roman"/>
-          <w:b/>
+          <w:rPrChange w:id="44" w:author="HP" w:date="2026-03-20T14:55:00Z">
+            <w:rPr>
+              <w:rFonts w:ascii="Times New Roman" w:hAnsi="Times New Roman" w:cs="Times New Roman"/>
+              <w:b/>
+            </w:rPr>
+          </w:rPrChange>
         </w:rPr>
         <w:t xml:space="preserve">Student 1 : </w:t>
       </w:r>
       <w:r>
         <w:rPr>
           <w:rFonts w:ascii="Times New Roman" w:hAnsi="Times New Roman" w:cs="Times New Roman"/>
+          <w:rPrChange w:id="45" w:author="HP" w:date="2026-03-20T14:55:00Z">
+            <w:rPr>
+              <w:rFonts w:ascii="Times New Roman" w:hAnsi="Times New Roman" w:cs="Times New Roman"/>
+            </w:rPr>
+          </w:rPrChange>
         </w:rPr>
         <w:t>Trần Duy Thành</w:t>
       </w:r>
@@ -532,6 +800,12 @@
         <w:rPr>
           <w:rFonts w:ascii="Times New Roman" w:hAnsi="Times New Roman" w:cs="Times New Roman"/>
           <w:b/>
+          <w:rPrChange w:id="46" w:author="HP" w:date="2026-03-20T14:55:00Z">
+            <w:rPr>
+              <w:rFonts w:ascii="Times New Roman" w:hAnsi="Times New Roman" w:cs="Times New Roman"/>
+              <w:b/>
+            </w:rPr>
+          </w:rPrChange>
         </w:rPr>
         <w:t xml:space="preserve"> </w:t>
       </w:r>
@@ -539,6 +813,12 @@
         <w:rPr>
           <w:rFonts w:ascii="Times New Roman" w:hAnsi="Times New Roman" w:cs="Times New Roman"/>
           <w:b/>
+          <w:rPrChange w:id="47" w:author="HP" w:date="2026-03-20T14:55:00Z">
+            <w:rPr>
+              <w:rFonts w:ascii="Times New Roman" w:hAnsi="Times New Roman" w:cs="Times New Roman"/>
+              <w:b/>
+            </w:rPr>
+          </w:rPrChange>
         </w:rPr>
         <w:tab/>
       </w:r>
@@ -546,6 +826,12 @@
         <w:rPr>
           <w:rFonts w:ascii="Times New Roman" w:hAnsi="Times New Roman" w:cs="Times New Roman"/>
           <w:b/>
+          <w:rPrChange w:id="48" w:author="HP" w:date="2026-03-20T14:55:00Z">
+            <w:rPr>
+              <w:rFonts w:ascii="Times New Roman" w:hAnsi="Times New Roman" w:cs="Times New Roman"/>
+              <w:b/>
+            </w:rPr>
+          </w:rPrChange>
         </w:rPr>
         <w:tab/>
       </w:r>
@@ -553,6 +839,12 @@
         <w:rPr>
           <w:rFonts w:ascii="Times New Roman" w:hAnsi="Times New Roman" w:cs="Times New Roman"/>
           <w:b/>
+          <w:rPrChange w:id="49" w:author="HP" w:date="2026-03-20T14:55:00Z">
+            <w:rPr>
+              <w:rFonts w:ascii="Times New Roman" w:hAnsi="Times New Roman" w:cs="Times New Roman"/>
+              <w:b/>
+            </w:rPr>
+          </w:rPrChange>
         </w:rPr>
         <w:tab/>
       </w:r>
@@ -560,6 +852,12 @@
         <w:rPr>
           <w:rFonts w:ascii="Times New Roman" w:hAnsi="Times New Roman" w:cs="Times New Roman"/>
           <w:b/>
+          <w:rPrChange w:id="50" w:author="HP" w:date="2026-03-20T14:55:00Z">
+            <w:rPr>
+              <w:rFonts w:ascii="Times New Roman" w:hAnsi="Times New Roman" w:cs="Times New Roman"/>
+              <w:b/>
+            </w:rPr>
+          </w:rPrChange>
         </w:rPr>
         <w:tab/>
         <w:t xml:space="preserve">ID : </w:t>
@@ -567,6 +865,11 @@
       <w:r>
         <w:rPr>
           <w:rFonts w:ascii="Times New Roman" w:hAnsi="Times New Roman" w:cs="Times New Roman"/>
+          <w:rPrChange w:id="51" w:author="HP" w:date="2026-03-20T14:55:00Z">
+            <w:rPr>
+              <w:rFonts w:ascii="Times New Roman" w:hAnsi="Times New Roman" w:cs="Times New Roman"/>
+            </w:rPr>
+          </w:rPrChange>
         </w:rPr>
         <w:t>2380602052</w:t>
       </w:r>
@@ -576,36 +879,67 @@
         <w:spacing w:before="0" w:after="0"/>
         <w:rPr>
           <w:rFonts w:ascii="Times New Roman" w:hAnsi="Times New Roman" w:cs="Times New Roman"/>
+          <w:rPrChange w:id="52" w:author="HP" w:date="2026-03-20T14:55:00Z">
+            <w:rPr>
+              <w:rFonts w:ascii="Times New Roman" w:hAnsi="Times New Roman" w:cs="Times New Roman"/>
+            </w:rPr>
+          </w:rPrChange>
         </w:rPr>
       </w:pPr>
       <w:r>
         <w:rPr>
           <w:rFonts w:ascii="Times New Roman" w:hAnsi="Times New Roman" w:cs="Times New Roman"/>
           <w:b/>
+          <w:rPrChange w:id="53" w:author="HP" w:date="2026-03-20T14:55:00Z">
+            <w:rPr>
+              <w:rFonts w:ascii="Times New Roman" w:hAnsi="Times New Roman" w:cs="Times New Roman"/>
+              <w:b/>
+            </w:rPr>
+          </w:rPrChange>
         </w:rPr>
         <w:t xml:space="preserve">Student 2  : </w:t>
       </w:r>
       <w:r>
         <w:rPr>
           <w:rFonts w:ascii="Times New Roman" w:hAnsi="Times New Roman" w:cs="Times New Roman"/>
+          <w:rPrChange w:id="54" w:author="HP" w:date="2026-03-20T14:55:00Z">
+            <w:rPr>
+              <w:rFonts w:ascii="Times New Roman" w:hAnsi="Times New Roman" w:cs="Times New Roman"/>
+            </w:rPr>
+          </w:rPrChange>
         </w:rPr>
         <w:t>Nguyễn Đình Quốc</w:t>
       </w:r>
       <w:r>
         <w:rPr>
           <w:rFonts w:ascii="Times New Roman" w:hAnsi="Times New Roman" w:cs="Times New Roman"/>
+          <w:rPrChange w:id="55" w:author="HP" w:date="2026-03-20T14:55:00Z">
+            <w:rPr>
+              <w:rFonts w:ascii="Times New Roman" w:hAnsi="Times New Roman" w:cs="Times New Roman"/>
+            </w:rPr>
+          </w:rPrChange>
         </w:rPr>
         <w:tab/>
       </w:r>
       <w:r>
         <w:rPr>
           <w:rFonts w:ascii="Times New Roman" w:hAnsi="Times New Roman" w:cs="Times New Roman"/>
+          <w:rPrChange w:id="56" w:author="HP" w:date="2026-03-20T14:55:00Z">
+            <w:rPr>
+              <w:rFonts w:ascii="Times New Roman" w:hAnsi="Times New Roman" w:cs="Times New Roman"/>
+            </w:rPr>
+          </w:rPrChange>
         </w:rPr>
         <w:tab/>
       </w:r>
       <w:r>
         <w:rPr>
           <w:rFonts w:ascii="Times New Roman" w:hAnsi="Times New Roman" w:cs="Times New Roman"/>
+          <w:rPrChange w:id="57" w:author="HP" w:date="2026-03-20T14:55:00Z">
+            <w:rPr>
+              <w:rFonts w:ascii="Times New Roman" w:hAnsi="Times New Roman" w:cs="Times New Roman"/>
+            </w:rPr>
+          </w:rPrChange>
         </w:rPr>
         <w:tab/>
       </w:r>
@@ -613,12 +947,23 @@
         <w:rPr>
           <w:rFonts w:ascii="Times New Roman" w:hAnsi="Times New Roman" w:cs="Times New Roman"/>
           <w:b/>
+          <w:rPrChange w:id="58" w:author="HP" w:date="2026-03-20T14:55:00Z">
+            <w:rPr>
+              <w:rFonts w:ascii="Times New Roman" w:hAnsi="Times New Roman" w:cs="Times New Roman"/>
+              <w:b/>
+            </w:rPr>
+          </w:rPrChange>
         </w:rPr>
         <w:t xml:space="preserve">ID : </w:t>
       </w:r>
       <w:r>
         <w:rPr>
           <w:rFonts w:ascii="Times New Roman" w:hAnsi="Times New Roman" w:cs="Times New Roman"/>
+          <w:rPrChange w:id="59" w:author="HP" w:date="2026-03-20T14:55:00Z">
+            <w:rPr>
+              <w:rFonts w:ascii="Times New Roman" w:hAnsi="Times New Roman" w:cs="Times New Roman"/>
+            </w:rPr>
+          </w:rPrChange>
         </w:rPr>
         <w:t>2380601854</w:t>
       </w:r>
@@ -629,36 +974,68 @@
         <w:rPr>
           <w:rFonts w:ascii="Times New Roman" w:hAnsi="Times New Roman" w:cs="Times New Roman"/>
           <w:b/>
+          <w:rPrChange w:id="60" w:author="HP" w:date="2026-03-20T14:55:00Z">
+            <w:rPr>
+              <w:rFonts w:ascii="Times New Roman" w:hAnsi="Times New Roman" w:cs="Times New Roman"/>
+              <w:b/>
+            </w:rPr>
+          </w:rPrChange>
         </w:rPr>
       </w:pPr>
       <w:r>
         <w:rPr>
           <w:rFonts w:ascii="Times New Roman" w:hAnsi="Times New Roman" w:cs="Times New Roman"/>
           <w:b/>
+          <w:rPrChange w:id="61" w:author="HP" w:date="2026-03-20T14:55:00Z">
+            <w:rPr>
+              <w:rFonts w:ascii="Times New Roman" w:hAnsi="Times New Roman" w:cs="Times New Roman"/>
+              <w:b/>
+            </w:rPr>
+          </w:rPrChange>
         </w:rPr>
         <w:t xml:space="preserve">Student 3 : </w:t>
       </w:r>
       <w:r>
         <w:rPr>
           <w:rFonts w:ascii="Times New Roman" w:hAnsi="Times New Roman" w:cs="Times New Roman"/>
+          <w:rPrChange w:id="62" w:author="HP" w:date="2026-03-20T14:55:00Z">
+            <w:rPr>
+              <w:rFonts w:ascii="Times New Roman" w:hAnsi="Times New Roman" w:cs="Times New Roman"/>
+            </w:rPr>
+          </w:rPrChange>
         </w:rPr>
         <w:t>Lê Nguyễn Bảo Khang</w:t>
       </w:r>
       <w:r>
         <w:rPr>
           <w:rFonts w:ascii="Times New Roman" w:hAnsi="Times New Roman" w:cs="Times New Roman"/>
+          <w:rPrChange w:id="63" w:author="HP" w:date="2026-03-20T14:55:00Z">
+            <w:rPr>
+              <w:rFonts w:ascii="Times New Roman" w:hAnsi="Times New Roman" w:cs="Times New Roman"/>
+            </w:rPr>
+          </w:rPrChange>
         </w:rPr>
         <w:tab/>
       </w:r>
       <w:r>
         <w:rPr>
           <w:rFonts w:ascii="Times New Roman" w:hAnsi="Times New Roman" w:cs="Times New Roman"/>
+          <w:rPrChange w:id="64" w:author="HP" w:date="2026-03-20T14:55:00Z">
+            <w:rPr>
+              <w:rFonts w:ascii="Times New Roman" w:hAnsi="Times New Roman" w:cs="Times New Roman"/>
+            </w:rPr>
+          </w:rPrChange>
         </w:rPr>
         <w:tab/>
       </w:r>
       <w:r>
         <w:rPr>
           <w:rFonts w:ascii="Times New Roman" w:hAnsi="Times New Roman" w:cs="Times New Roman"/>
+          <w:rPrChange w:id="65" w:author="HP" w:date="2026-03-20T14:55:00Z">
+            <w:rPr>
+              <w:rFonts w:ascii="Times New Roman" w:hAnsi="Times New Roman" w:cs="Times New Roman"/>
+            </w:rPr>
+          </w:rPrChange>
         </w:rPr>
         <w:tab/>
       </w:r>
@@ -666,180 +1043,531 @@
         <w:rPr>
           <w:rFonts w:ascii="Times New Roman" w:hAnsi="Times New Roman" w:cs="Times New Roman"/>
           <w:b/>
+          <w:rPrChange w:id="66" w:author="HP" w:date="2026-03-20T14:55:00Z">
+            <w:rPr>
+              <w:rFonts w:ascii="Times New Roman" w:hAnsi="Times New Roman" w:cs="Times New Roman"/>
+              <w:b/>
+            </w:rPr>
+          </w:rPrChange>
         </w:rPr>
         <w:t xml:space="preserve">ID : </w:t>
       </w:r>
       <w:r>
         <w:rPr>
           <w:rFonts w:ascii="Times New Roman" w:hAnsi="Times New Roman" w:cs="Times New Roman"/>
+          <w:rPrChange w:id="67" w:author="HP" w:date="2026-03-20T14:55:00Z">
+            <w:rPr>
+              <w:rFonts w:ascii="Times New Roman" w:hAnsi="Times New Roman" w:cs="Times New Roman"/>
+            </w:rPr>
+          </w:rPrChange>
         </w:rPr>
         <w:t>2380600979</w:t>
       </w:r>
     </w:p>
-    <w:p/>
+    <w:p>
+      <w:pPr>
+        <w:rPr>
+          <w:rFonts w:ascii="Times New Roman" w:hAnsi="Times New Roman" w:cs="Times New Roman"/>
+          <w:rPrChange w:id="68" w:author="HP" w:date="2026-03-20T14:55:00Z">
+            <w:rPr/>
+          </w:rPrChange>
+        </w:rPr>
+      </w:pPr>
+    </w:p>
     <w:p>
       <w:pPr>
         <w:spacing w:before="0" w:after="160" w:line="259" w:lineRule="auto"/>
+        <w:rPr>
+          <w:rFonts w:ascii="Times New Roman" w:hAnsi="Times New Roman" w:cs="Times New Roman"/>
+          <w:rPrChange w:id="69" w:author="HP" w:date="2026-03-20T14:55:00Z">
+            <w:rPr/>
+          </w:rPrChange>
+        </w:rPr>
       </w:pPr>
       <w:r>
+        <w:rPr>
+          <w:rFonts w:ascii="Times New Roman" w:hAnsi="Times New Roman" w:cs="Times New Roman"/>
+          <w:rPrChange w:id="70" w:author="HP" w:date="2026-03-20T14:55:00Z">
+            <w:rPr/>
+          </w:rPrChange>
+        </w:rPr>
         <w:br w:type="page"/>
       </w:r>
     </w:p>
     <w:p>
       <w:pPr>
         <w:pStyle w:val="Heading1"/>
+        <w:rPr>
+          <w:rFonts w:ascii="Times New Roman" w:hAnsi="Times New Roman" w:cs="Times New Roman"/>
+          <w:sz w:val="24"/>
+          <w:szCs w:val="24"/>
+          <w:rPrChange w:id="71" w:author="HP" w:date="2026-03-20T14:55:00Z">
+            <w:rPr/>
+          </w:rPrChange>
+        </w:rPr>
       </w:pPr>
       <w:r>
+        <w:rPr>
+          <w:rFonts w:ascii="Times New Roman" w:hAnsi="Times New Roman" w:cs="Times New Roman"/>
+          <w:sz w:val="24"/>
+          <w:szCs w:val="24"/>
+          <w:rPrChange w:id="72" w:author="HP" w:date="2026-03-20T14:55:00Z">
+            <w:rPr/>
+          </w:rPrChange>
+        </w:rPr>
         <w:lastRenderedPageBreak/>
-        <w:t>I</w:t>
+        <w:t xml:space="preserve">I. </w:t>
       </w:r>
       <w:r>
-        <w:t xml:space="preserve">. </w:t>
-      </w:r>
-      <w:r>
+        <w:rPr>
+          <w:rFonts w:ascii="Times New Roman" w:hAnsi="Times New Roman" w:cs="Times New Roman"/>
+          <w:sz w:val="24"/>
+          <w:szCs w:val="24"/>
+          <w:rPrChange w:id="73" w:author="HP" w:date="2026-03-20T14:55:00Z">
+            <w:rPr/>
+          </w:rPrChange>
+        </w:rPr>
         <w:t xml:space="preserve">Introduction </w:t>
       </w:r>
     </w:p>
     <w:p>
       <w:pPr>
-        <w:rPr>
-          <w:ins w:id="1" w:author="HP" w:date="2026-03-19T10:22:00Z"/>
-          <w:rFonts w:ascii="Times New Roman" w:hAnsi="Times New Roman" w:cs="Times New Roman"/>
-        </w:rPr>
-      </w:pPr>
-      <w:r>
-        <w:rPr>
-          <w:rFonts w:ascii="Times New Roman" w:hAnsi="Times New Roman" w:cs="Times New Roman"/>
-        </w:rPr>
-        <w:t xml:space="preserve">This chatbot system had build by AI and API of </w:t>
-      </w:r>
-      <w:del w:id="2" w:author="HP" w:date="2026-03-19T10:45:00Z">
-        <w:r>
-          <w:rPr>
-            <w:rFonts w:ascii="Times New Roman" w:hAnsi="Times New Roman" w:cs="Times New Roman"/>
-          </w:rPr>
-          <w:delText>OpenAI</w:delText>
-        </w:r>
-        <w:r>
-          <w:rPr>
-            <w:rFonts w:ascii="Times New Roman" w:hAnsi="Times New Roman" w:cs="Times New Roman"/>
-          </w:rPr>
-          <w:delText xml:space="preserve">, </w:delText>
+        <w:spacing w:before="0" w:after="0"/>
+        <w:rPr>
+          <w:rFonts w:ascii="Times New Roman" w:hAnsi="Times New Roman" w:cs="Times New Roman"/>
+          <w:rPrChange w:id="74" w:author="HP" w:date="2026-03-20T14:55:00Z">
+            <w:rPr/>
+          </w:rPrChange>
+        </w:rPr>
+        <w:pPrChange w:id="75" w:author="HP" w:date="2026-03-20T14:44:00Z">
+          <w:pPr/>
+        </w:pPrChange>
+      </w:pPr>
+      <w:ins w:id="76" w:author="HP" w:date="2026-03-20T14:43:00Z">
+        <w:r>
+          <w:rPr>
+            <w:rFonts w:ascii="Times New Roman" w:hAnsi="Times New Roman" w:cs="Times New Roman"/>
+            <w:rPrChange w:id="77" w:author="HP" w:date="2026-03-20T14:55:00Z">
+              <w:rPr/>
+            </w:rPrChange>
+          </w:rPr>
+          <w:t>This project presents a Vietnamese Traffic Law Consultation Chatbot, developed using Artificial Intellige</w:t>
+        </w:r>
+        <w:r>
+          <w:rPr>
+            <w:rFonts w:ascii="Times New Roman" w:hAnsi="Times New Roman" w:cs="Times New Roman"/>
+            <w:rPrChange w:id="78" w:author="HP" w:date="2026-03-20T14:55:00Z">
+              <w:rPr>
+                <w:sz w:val="20"/>
+                <w:szCs w:val="20"/>
+              </w:rPr>
+            </w:rPrChange>
+          </w:rPr>
+          <w:t xml:space="preserve">nce and the Google Gemini API. </w:t>
+        </w:r>
+        <w:r>
+          <w:rPr>
+            <w:rFonts w:ascii="Times New Roman" w:hAnsi="Times New Roman" w:cs="Times New Roman"/>
+            <w:rPrChange w:id="79" w:author="HP" w:date="2026-03-20T14:55:00Z">
+              <w:rPr/>
+            </w:rPrChange>
+          </w:rPr>
+          <w:br/>
+          <w:t>The system aims to assist users in retrieving legal information related to traffic regulations in Vietnam, including traffic laws, penalties, road signs, an</w:t>
+        </w:r>
+        <w:r>
+          <w:rPr>
+            <w:rFonts w:ascii="Times New Roman" w:hAnsi="Times New Roman" w:cs="Times New Roman"/>
+            <w:rPrChange w:id="80" w:author="HP" w:date="2026-03-20T14:55:00Z">
+              <w:rPr>
+                <w:sz w:val="20"/>
+                <w:szCs w:val="20"/>
+              </w:rPr>
+            </w:rPrChange>
+          </w:rPr>
+          <w:t>d driving license requirements.</w:t>
+        </w:r>
+        <w:r>
+          <w:rPr>
+            <w:rFonts w:ascii="Times New Roman" w:hAnsi="Times New Roman" w:cs="Times New Roman"/>
+            <w:rPrChange w:id="81" w:author="HP" w:date="2026-03-20T14:55:00Z">
+              <w:rPr/>
+            </w:rPrChange>
+          </w:rPr>
+          <w:br/>
+          <w:t>The chatbot is designed to handle natural language queries and provide accurate legal references in various real-world situations.</w:t>
+        </w:r>
+      </w:ins>
+      <w:del w:id="82" w:author="HP" w:date="2026-03-20T14:43:00Z">
+        <w:r>
+          <w:rPr>
+            <w:rFonts w:ascii="Times New Roman" w:hAnsi="Times New Roman" w:cs="Times New Roman"/>
+            <w:rPrChange w:id="83" w:author="HP" w:date="2026-03-20T14:55:00Z">
+              <w:rPr>
+                <w:rFonts w:ascii="Times New Roman" w:hAnsi="Times New Roman" w:cs="Times New Roman"/>
+              </w:rPr>
+            </w:rPrChange>
+          </w:rPr>
+          <w:delText xml:space="preserve">This chatbot system had build by AI and API of </w:delText>
+        </w:r>
+      </w:del>
+      <w:del w:id="84" w:author="HP" w:date="2026-03-19T10:45:00Z">
+        <w:r>
+          <w:rPr>
+            <w:rFonts w:ascii="Times New Roman" w:hAnsi="Times New Roman" w:cs="Times New Roman"/>
+            <w:rPrChange w:id="85" w:author="HP" w:date="2026-03-20T14:55:00Z">
+              <w:rPr>
+                <w:rFonts w:ascii="Times New Roman" w:hAnsi="Times New Roman" w:cs="Times New Roman"/>
+              </w:rPr>
+            </w:rPrChange>
+          </w:rPr>
+          <w:delText xml:space="preserve">OpenAI, </w:delText>
+        </w:r>
+      </w:del>
+      <w:del w:id="86" w:author="HP" w:date="2026-03-20T14:43:00Z">
+        <w:r>
+          <w:rPr>
+            <w:rFonts w:ascii="Times New Roman" w:hAnsi="Times New Roman" w:cs="Times New Roman"/>
+            <w:rPrChange w:id="87" w:author="HP" w:date="2026-03-20T14:55:00Z">
+              <w:rPr>
+                <w:rFonts w:ascii="Times New Roman" w:hAnsi="Times New Roman" w:cs="Times New Roman"/>
+              </w:rPr>
+            </w:rPrChange>
+          </w:rPr>
+          <w:delText>Google Gemini.</w:delText>
+        </w:r>
+      </w:del>
+      <w:ins w:id="88" w:author="HP" w:date="2026-03-19T10:22:00Z">
+        <w:r>
+          <w:rPr>
+            <w:rFonts w:ascii="Times New Roman" w:hAnsi="Times New Roman" w:cs="Times New Roman"/>
+            <w:rPrChange w:id="89" w:author="HP" w:date="2026-03-20T14:55:00Z">
+              <w:rPr/>
+            </w:rPrChange>
+          </w:rPr>
+          <w:t>II Infomation</w:t>
+        </w:r>
+      </w:ins>
+    </w:p>
+    <w:p>
+      <w:pPr>
+        <w:pStyle w:val="Heading2"/>
+        <w:rPr>
+          <w:rFonts w:ascii="Times New Roman" w:hAnsi="Times New Roman" w:cs="Times New Roman"/>
+          <w:sz w:val="24"/>
+          <w:szCs w:val="24"/>
+          <w:rPrChange w:id="90" w:author="HP" w:date="2026-03-20T14:55:00Z">
+            <w:rPr/>
+          </w:rPrChange>
+        </w:rPr>
+      </w:pPr>
+      <w:ins w:id="91" w:author="HP" w:date="2026-03-19T10:22:00Z">
+        <w:r>
+          <w:rPr>
+            <w:rFonts w:ascii="Times New Roman" w:hAnsi="Times New Roman" w:cs="Times New Roman"/>
+            <w:sz w:val="24"/>
+            <w:szCs w:val="24"/>
+            <w:rPrChange w:id="92" w:author="HP" w:date="2026-03-20T14:55:00Z">
+              <w:rPr/>
+            </w:rPrChange>
+          </w:rPr>
+          <w:t>2</w:t>
+        </w:r>
+      </w:ins>
+      <w:del w:id="93" w:author="HP" w:date="2026-03-19T10:22:00Z">
+        <w:r>
+          <w:rPr>
+            <w:rFonts w:ascii="Times New Roman" w:hAnsi="Times New Roman" w:cs="Times New Roman"/>
+            <w:sz w:val="24"/>
+            <w:szCs w:val="24"/>
+            <w:rPrChange w:id="94" w:author="HP" w:date="2026-03-20T14:55:00Z">
+              <w:rPr/>
+            </w:rPrChange>
+          </w:rPr>
+          <w:delText>1</w:delText>
         </w:r>
       </w:del>
       <w:r>
         <w:rPr>
           <w:rFonts w:ascii="Times New Roman" w:hAnsi="Times New Roman" w:cs="Times New Roman"/>
-        </w:rPr>
-        <w:t>Google Gemini</w:t>
+          <w:sz w:val="24"/>
+          <w:szCs w:val="24"/>
+          <w:rPrChange w:id="95" w:author="HP" w:date="2026-03-20T14:55:00Z">
+            <w:rPr/>
+          </w:rPrChange>
+        </w:rPr>
+        <w:t>.1 Information of the website :</w:t>
       </w:r>
-      <w:ins w:id="3" w:author="HP" w:date="2026-03-19T10:45:00Z">
-        <w:r>
-          <w:rPr>
-            <w:rFonts w:ascii="Times New Roman" w:hAnsi="Times New Roman" w:cs="Times New Roman"/>
-          </w:rPr>
-          <w:t>, application for people who want to get know more information a</w:t>
-        </w:r>
-      </w:ins>
-      <w:ins w:id="4" w:author="HP" w:date="2026-03-19T10:46:00Z">
-        <w:r>
-          <w:rPr>
-            <w:rFonts w:ascii="Times New Roman" w:hAnsi="Times New Roman" w:cs="Times New Roman"/>
-          </w:rPr>
-          <w:t>bout traffic law and application law in many condition</w:t>
-        </w:r>
-      </w:ins>
+    </w:p>
+    <w:p>
+      <w:pPr>
+        <w:rPr>
+          <w:rFonts w:ascii="Times New Roman" w:hAnsi="Times New Roman" w:cs="Times New Roman"/>
+          <w:rPrChange w:id="96" w:author="HP" w:date="2026-03-20T14:55:00Z">
+            <w:rPr/>
+          </w:rPrChange>
+        </w:rPr>
+      </w:pPr>
       <w:r>
         <w:rPr>
           <w:rFonts w:ascii="Times New Roman" w:hAnsi="Times New Roman" w:cs="Times New Roman"/>
-        </w:rPr>
-        <w:t>.</w:t>
+          <w:rPrChange w:id="97" w:author="HP" w:date="2026-03-20T14:55:00Z">
+            <w:rPr/>
+          </w:rPrChange>
+        </w:rPr>
+        <w:t>Name : VietNamese Traffic Law Consulation</w:t>
       </w:r>
-    </w:p>
-    <w:p>
-      <w:pPr>
-        <w:pStyle w:val="Heading1"/>
-        <w:pPrChange w:id="5" w:author="HP" w:date="2026-03-19T10:22:00Z">
+      <w:ins w:id="98" w:author="HP" w:date="2026-03-20T14:44:00Z">
+        <w:r>
+          <w:rPr>
+            <w:rFonts w:ascii="Times New Roman" w:hAnsi="Times New Roman" w:cs="Times New Roman"/>
+            <w:rPrChange w:id="99" w:author="HP" w:date="2026-03-20T14:55:00Z">
+              <w:rPr/>
+            </w:rPrChange>
+          </w:rPr>
+          <w:t xml:space="preserve"> Chatbot</w:t>
+        </w:r>
+      </w:ins>
+    </w:p>
+    <w:p>
+      <w:pPr>
+        <w:rPr>
+          <w:ins w:id="100" w:author="HP" w:date="2026-03-20T14:44:00Z"/>
+          <w:rFonts w:ascii="Times New Roman" w:hAnsi="Times New Roman" w:cs="Times New Roman"/>
+          <w:rPrChange w:id="101" w:author="HP" w:date="2026-03-20T14:55:00Z">
+            <w:rPr>
+              <w:ins w:id="102" w:author="HP" w:date="2026-03-20T14:44:00Z"/>
+            </w:rPr>
+          </w:rPrChange>
+        </w:rPr>
+      </w:pPr>
+      <w:ins w:id="103" w:author="HP" w:date="2026-03-19T10:47:00Z">
+        <w:r>
+          <w:rPr>
+            <w:rFonts w:ascii="Times New Roman" w:hAnsi="Times New Roman" w:cs="Times New Roman"/>
+            <w:rPrChange w:id="104" w:author="HP" w:date="2026-03-20T14:55:00Z">
+              <w:rPr/>
+            </w:rPrChange>
+          </w:rPr>
+          <w:t xml:space="preserve">Website : </w:t>
+        </w:r>
+      </w:ins>
+      <w:ins w:id="105" w:author="HP" w:date="2026-03-20T14:44:00Z">
+        <w:r>
+          <w:rPr>
+            <w:rFonts w:ascii="Times New Roman" w:hAnsi="Times New Roman" w:cs="Times New Roman"/>
+            <w:rPrChange w:id="106" w:author="HP" w:date="2026-03-20T14:55:00Z">
+              <w:rPr/>
+            </w:rPrChange>
+          </w:rPr>
+          <w:t>updating</w:t>
+        </w:r>
+      </w:ins>
+    </w:p>
+    <w:p>
+      <w:pPr>
+        <w:rPr>
+          <w:ins w:id="107" w:author="HP" w:date="2026-03-19T10:47:00Z"/>
+          <w:rFonts w:ascii="Times New Roman" w:hAnsi="Times New Roman" w:cs="Times New Roman"/>
+          <w:rPrChange w:id="108" w:author="HP" w:date="2026-03-20T14:55:00Z">
+            <w:rPr>
+              <w:ins w:id="109" w:author="HP" w:date="2026-03-19T10:47:00Z"/>
+            </w:rPr>
+          </w:rPrChange>
+        </w:rPr>
+      </w:pPr>
+      <w:ins w:id="110" w:author="HP" w:date="2026-03-20T14:44:00Z">
+        <w:r>
+          <w:rPr>
+            <w:rFonts w:ascii="Times New Roman" w:hAnsi="Times New Roman" w:cs="Times New Roman"/>
+            <w:rPrChange w:id="111" w:author="HP" w:date="2026-03-20T14:55:00Z">
+              <w:rPr/>
+            </w:rPrChange>
+          </w:rPr>
+          <w:t>Platform :</w:t>
+        </w:r>
+      </w:ins>
+    </w:p>
+    <w:p>
+      <w:pPr>
+        <w:rPr>
+          <w:rFonts w:ascii="Times New Roman" w:hAnsi="Times New Roman" w:cs="Times New Roman"/>
+          <w:rPrChange w:id="112" w:author="HP" w:date="2026-03-20T14:55:00Z">
+            <w:rPr/>
+          </w:rPrChange>
+        </w:rPr>
+      </w:pPr>
+    </w:p>
+    <w:p>
+      <w:pPr>
+        <w:pStyle w:val="Heading2"/>
+        <w:rPr>
+          <w:ins w:id="113" w:author="HP" w:date="2026-03-20T14:55:00Z"/>
+          <w:rFonts w:ascii="Times New Roman" w:hAnsi="Times New Roman" w:cs="Times New Roman"/>
+          <w:sz w:val="24"/>
+          <w:szCs w:val="24"/>
+          <w:rPrChange w:id="114" w:author="HP" w:date="2026-03-20T14:55:00Z">
+            <w:rPr>
+              <w:ins w:id="115" w:author="HP" w:date="2026-03-20T14:55:00Z"/>
+            </w:rPr>
+          </w:rPrChange>
+        </w:rPr>
+        <w:pPrChange w:id="116" w:author="HP" w:date="2026-03-19T10:22:00Z">
           <w:pPr/>
         </w:pPrChange>
       </w:pPr>
-      <w:ins w:id="6" w:author="HP" w:date="2026-03-19T10:22:00Z">
-        <w:r>
-          <w:t>II Infomation</w:t>
-        </w:r>
-      </w:ins>
-    </w:p>
-    <w:p>
-      <w:pPr>
-        <w:pStyle w:val="Heading2"/>
-      </w:pPr>
-      <w:ins w:id="7" w:author="HP" w:date="2026-03-19T10:22:00Z">
-        <w:r>
+      <w:ins w:id="117" w:author="HP" w:date="2026-03-19T10:22:00Z">
+        <w:r>
+          <w:rPr>
+            <w:rFonts w:ascii="Times New Roman" w:hAnsi="Times New Roman" w:cs="Times New Roman"/>
+            <w:sz w:val="24"/>
+            <w:szCs w:val="24"/>
+            <w:rPrChange w:id="118" w:author="HP" w:date="2026-03-20T14:55:00Z">
+              <w:rPr/>
+            </w:rPrChange>
+          </w:rPr>
           <w:t>2</w:t>
         </w:r>
       </w:ins>
-      <w:del w:id="8" w:author="HP" w:date="2026-03-19T10:22:00Z">
-        <w:r>
+      <w:del w:id="119" w:author="HP" w:date="2026-03-19T10:22:00Z">
+        <w:r>
+          <w:rPr>
+            <w:rFonts w:ascii="Times New Roman" w:hAnsi="Times New Roman" w:cs="Times New Roman"/>
+            <w:sz w:val="24"/>
+            <w:szCs w:val="24"/>
+            <w:rPrChange w:id="120" w:author="HP" w:date="2026-03-20T14:55:00Z">
+              <w:rPr/>
+            </w:rPrChange>
+          </w:rPr>
           <w:delText>1</w:delText>
         </w:r>
       </w:del>
       <w:r>
-        <w:t>.1 Information of the website :</w:t>
+        <w:rPr>
+          <w:rFonts w:ascii="Times New Roman" w:hAnsi="Times New Roman" w:cs="Times New Roman"/>
+          <w:sz w:val="24"/>
+          <w:szCs w:val="24"/>
+          <w:rPrChange w:id="121" w:author="HP" w:date="2026-03-20T14:55:00Z">
+            <w:rPr/>
+          </w:rPrChange>
+        </w:rPr>
+        <w:t>.2 Basic Data preprocessing :</w:t>
       </w:r>
     </w:p>
     <w:p>
-      <w:r>
-        <w:t>Name : VietNamese Traffic Law Consulation</w:t>
-      </w:r>
-    </w:p>
-    <w:p>
-      <w:pPr>
-        <w:rPr>
-          <w:ins w:id="9" w:author="HP" w:date="2026-03-19T10:47:00Z"/>
-        </w:rPr>
-      </w:pPr>
-      <w:ins w:id="10" w:author="HP" w:date="2026-03-19T10:47:00Z">
-        <w:r>
-          <w:t>Website : none</w:t>
-        </w:r>
-      </w:ins>
-    </w:p>
-    <w:p/>
-    <w:p>
-      <w:pPr>
-        <w:pStyle w:val="Heading2"/>
-        <w:pPrChange w:id="11" w:author="HP" w:date="2026-03-19T10:22:00Z">
+      <w:pPr>
+        <w:rPr>
+          <w:rFonts w:ascii="Times New Roman" w:hAnsi="Times New Roman" w:cs="Times New Roman"/>
+          <w:rPrChange w:id="122" w:author="HP" w:date="2026-03-20T14:55:00Z">
+            <w:rPr/>
+          </w:rPrChange>
+        </w:rPr>
+        <w:pPrChange w:id="123" w:author="HP" w:date="2026-03-20T14:55:00Z">
           <w:pPr/>
         </w:pPrChange>
       </w:pPr>
-      <w:ins w:id="12" w:author="HP" w:date="2026-03-19T10:22:00Z">
-        <w:r>
-          <w:t>2</w:t>
-        </w:r>
-      </w:ins>
-      <w:del w:id="13" w:author="HP" w:date="2026-03-19T10:22:00Z">
-        <w:r>
-          <w:delText>1</w:delText>
-        </w:r>
-      </w:del>
-      <w:r>
-        <w:t>.2 Basic Data preprocessing :</w:t>
-      </w:r>
+      <w:ins w:id="124" w:author="HP" w:date="2026-03-20T14:55:00Z">
+        <w:r>
+          <w:rPr>
+            <w:rFonts w:ascii="Times New Roman" w:hAnsi="Times New Roman" w:cs="Times New Roman"/>
+            <w:rPrChange w:id="125" w:author="HP" w:date="2026-03-20T14:55:00Z">
+              <w:rPr/>
+            </w:rPrChange>
+          </w:rPr>
+          <w:t>The collected data is preprocessed before being used in the chatbot system:</w:t>
+        </w:r>
+        <w:r>
+          <w:rPr>
+            <w:rFonts w:ascii="Times New Roman" w:hAnsi="Times New Roman" w:cs="Times New Roman"/>
+            <w:rPrChange w:id="126" w:author="HP" w:date="2026-03-20T14:55:00Z">
+              <w:rPr/>
+            </w:rPrChange>
+          </w:rPr>
+          <w:br/>
+        </w:r>
+        <w:r>
+          <w:rPr>
+            <w:rFonts w:ascii="Times New Roman" w:hAnsi="Times New Roman" w:cs="Times New Roman"/>
+            <w:rPrChange w:id="127" w:author="HP" w:date="2026-03-20T14:55:00Z">
+              <w:rPr/>
+            </w:rPrChange>
+          </w:rPr>
+          <w:br/>
+          <w:t>- Removing HTML tags and unnecessary symbols</w:t>
+        </w:r>
+        <w:r>
+          <w:rPr>
+            <w:rFonts w:ascii="Times New Roman" w:hAnsi="Times New Roman" w:cs="Times New Roman"/>
+            <w:rPrChange w:id="128" w:author="HP" w:date="2026-03-20T14:55:00Z">
+              <w:rPr/>
+            </w:rPrChange>
+          </w:rPr>
+          <w:br/>
+          <w:t>- Standardizing text format</w:t>
+        </w:r>
+        <w:r>
+          <w:rPr>
+            <w:rFonts w:ascii="Times New Roman" w:hAnsi="Times New Roman" w:cs="Times New Roman"/>
+            <w:rPrChange w:id="129" w:author="HP" w:date="2026-03-20T14:55:00Z">
+              <w:rPr/>
+            </w:rPrChange>
+          </w:rPr>
+          <w:br/>
+          <w:t>- Splitting legal documents into smaller chunks</w:t>
+        </w:r>
+        <w:r>
+          <w:rPr>
+            <w:rFonts w:ascii="Times New Roman" w:hAnsi="Times New Roman" w:cs="Times New Roman"/>
+            <w:rPrChange w:id="130" w:author="HP" w:date="2026-03-20T14:55:00Z">
+              <w:rPr/>
+            </w:rPrChange>
+          </w:rPr>
+          <w:br/>
+          <w:t>- Mapping legal references (article, clause)</w:t>
+        </w:r>
+        <w:r>
+          <w:rPr>
+            <w:rFonts w:ascii="Times New Roman" w:hAnsi="Times New Roman" w:cs="Times New Roman"/>
+            <w:rPrChange w:id="131" w:author="HP" w:date="2026-03-20T14:55:00Z">
+              <w:rPr/>
+            </w:rPrChange>
+          </w:rPr>
+          <w:br/>
+          <w:t>- Converting data into JSON format</w:t>
+        </w:r>
+        <w:r>
+          <w:rPr>
+            <w:rFonts w:ascii="Times New Roman" w:hAnsi="Times New Roman" w:cs="Times New Roman"/>
+            <w:rPrChange w:id="132" w:author="HP" w:date="2026-03-20T14:55:00Z">
+              <w:rPr/>
+            </w:rPrChange>
+          </w:rPr>
+          <w:br/>
+        </w:r>
+        <w:r>
+          <w:rPr>
+            <w:rFonts w:ascii="Times New Roman" w:hAnsi="Times New Roman" w:cs="Times New Roman"/>
+            <w:rPrChange w:id="133" w:author="HP" w:date="2026-03-20T14:55:00Z">
+              <w:rPr/>
+            </w:rPrChange>
+          </w:rPr>
+          <w:br/>
+          <w:t>This step ensures that the data is clean, structured, and suitable for AI processing.</w:t>
+        </w:r>
+      </w:ins>
     </w:p>
     <w:p>
       <w:pPr>
         <w:spacing w:before="0" w:after="0" w:line="315" w:lineRule="atLeast"/>
         <w:rPr>
-          <w:ins w:id="14" w:author="HP" w:date="2026-03-19T10:15:00Z"/>
-          <w:rFonts w:ascii="Roboto" w:eastAsia="Times New Roman" w:hAnsi="Roboto" w:cs="Arial"/>
+          <w:ins w:id="134" w:author="HP" w:date="2026-03-19T10:15:00Z"/>
+          <w:rFonts w:ascii="Times New Roman" w:eastAsia="Times New Roman" w:hAnsi="Times New Roman" w:cs="Times New Roman"/>
           <w:color w:val="62748D"/>
           <w:kern w:val="0"/>
-          <w:sz w:val="23"/>
-          <w:szCs w:val="23"/>
           <w14:ligatures w14:val="none"/>
-          <w:rPrChange w:id="15" w:author="HP" w:date="2026-03-19T10:20:00Z">
-            <w:rPr>
-              <w:ins w:id="16" w:author="HP" w:date="2026-03-19T10:15:00Z"/>
+          <w:rPrChange w:id="135" w:author="HP" w:date="2026-03-20T14:55:00Z">
+            <w:rPr>
+              <w:ins w:id="136" w:author="HP" w:date="2026-03-19T10:15:00Z"/>
               <w:rFonts w:ascii="Roboto" w:eastAsia="Times New Roman" w:hAnsi="Roboto" w:cs="Arial"/>
               <w:color w:val="182940"/>
               <w:kern w:val="0"/>
@@ -851,213 +1579,357 @@
         </w:rPr>
       </w:pPr>
       <w:r>
+        <w:rPr>
+          <w:rFonts w:ascii="Times New Roman" w:hAnsi="Times New Roman" w:cs="Times New Roman"/>
+          <w:rPrChange w:id="137" w:author="HP" w:date="2026-03-20T14:55:00Z">
+            <w:rPr/>
+          </w:rPrChange>
+        </w:rPr>
         <w:t>Arrcording to</w:t>
       </w:r>
-      <w:del w:id="17" w:author="HP" w:date="2026-03-19T10:12:00Z">
-        <w:r>
+      <w:del w:id="138" w:author="HP" w:date="2026-03-19T10:12:00Z">
+        <w:r>
+          <w:rPr>
+            <w:rFonts w:ascii="Times New Roman" w:hAnsi="Times New Roman" w:cs="Times New Roman"/>
+            <w:rPrChange w:id="139" w:author="HP" w:date="2026-03-20T14:55:00Z">
+              <w:rPr/>
+            </w:rPrChange>
+          </w:rPr>
           <w:delText xml:space="preserve"> </w:delText>
         </w:r>
       </w:del>
-      <w:ins w:id="18" w:author="HP" w:date="2026-03-19T10:12:00Z">
-        <w:r>
+      <w:ins w:id="140" w:author="HP" w:date="2026-03-19T10:12:00Z">
+        <w:r>
+          <w:rPr>
+            <w:rFonts w:ascii="Times New Roman" w:hAnsi="Times New Roman" w:cs="Times New Roman"/>
+            <w:rPrChange w:id="141" w:author="HP" w:date="2026-03-20T14:55:00Z">
+              <w:rPr/>
+            </w:rPrChange>
+          </w:rPr>
           <w:t xml:space="preserve"> Thư viện pháp luật ( </w:t>
         </w:r>
         <w:r>
+          <w:rPr>
+            <w:rFonts w:ascii="Times New Roman" w:hAnsi="Times New Roman" w:cs="Times New Roman"/>
+            <w:rPrChange w:id="142" w:author="HP" w:date="2026-03-20T14:55:00Z">
+              <w:rPr/>
+            </w:rPrChange>
+          </w:rPr>
           <w:fldChar w:fldCharType="begin"/>
         </w:r>
         <w:r>
+          <w:rPr>
+            <w:rFonts w:ascii="Times New Roman" w:hAnsi="Times New Roman" w:cs="Times New Roman"/>
+            <w:rPrChange w:id="143" w:author="HP" w:date="2026-03-20T14:55:00Z">
+              <w:rPr/>
+            </w:rPrChange>
+          </w:rPr>
           <w:instrText xml:space="preserve"> HYPERLINK "https://thuvienphapluat.vn" </w:instrText>
         </w:r>
         <w:r>
+          <w:rPr>
+            <w:rFonts w:ascii="Times New Roman" w:hAnsi="Times New Roman" w:cs="Times New Roman"/>
+            <w:rPrChange w:id="144" w:author="HP" w:date="2026-03-20T14:55:00Z">
+              <w:rPr/>
+            </w:rPrChange>
+          </w:rPr>
           <w:fldChar w:fldCharType="separate"/>
         </w:r>
         <w:r>
           <w:rPr>
             <w:rStyle w:val="Hyperlink"/>
+            <w:rFonts w:ascii="Times New Roman" w:hAnsi="Times New Roman" w:cs="Times New Roman"/>
+            <w:rPrChange w:id="145" w:author="HP" w:date="2026-03-20T14:55:00Z">
+              <w:rPr>
+                <w:rStyle w:val="Hyperlink"/>
+              </w:rPr>
+            </w:rPrChange>
           </w:rPr>
           <w:t>https://thuvienphapluat.vn</w:t>
         </w:r>
         <w:r>
+          <w:rPr>
+            <w:rFonts w:ascii="Times New Roman" w:hAnsi="Times New Roman" w:cs="Times New Roman"/>
+            <w:rPrChange w:id="146" w:author="HP" w:date="2026-03-20T14:55:00Z">
+              <w:rPr/>
+            </w:rPrChange>
+          </w:rPr>
           <w:fldChar w:fldCharType="end"/>
         </w:r>
         <w:r>
+          <w:rPr>
+            <w:rFonts w:ascii="Times New Roman" w:hAnsi="Times New Roman" w:cs="Times New Roman"/>
+            <w:rPrChange w:id="147" w:author="HP" w:date="2026-03-20T14:55:00Z">
+              <w:rPr/>
+            </w:rPrChange>
+          </w:rPr>
           <w:t xml:space="preserve"> ),</w:t>
         </w:r>
       </w:ins>
-      <w:ins w:id="19" w:author="HP" w:date="2026-03-19T10:13:00Z">
-        <w:r>
+      <w:ins w:id="148" w:author="HP" w:date="2026-03-19T10:13:00Z">
+        <w:r>
+          <w:rPr>
+            <w:rFonts w:ascii="Times New Roman" w:hAnsi="Times New Roman" w:cs="Times New Roman"/>
+            <w:rPrChange w:id="149" w:author="HP" w:date="2026-03-20T14:55:00Z">
+              <w:rPr/>
+            </w:rPrChange>
+          </w:rPr>
           <w:t>National Databases about Law (</w:t>
         </w:r>
         <w:r>
+          <w:rPr>
+            <w:rFonts w:ascii="Times New Roman" w:hAnsi="Times New Roman" w:cs="Times New Roman"/>
+            <w:rPrChange w:id="150" w:author="HP" w:date="2026-03-20T14:55:00Z">
+              <w:rPr/>
+            </w:rPrChange>
+          </w:rPr>
           <w:fldChar w:fldCharType="begin"/>
         </w:r>
         <w:r>
-          <w:instrText xml:space="preserve"> HYPERLINK "</w:instrText>
-        </w:r>
-        <w:r>
-          <w:instrText>https://vbpl.vn/pages/portal.aspx</w:instrText>
-        </w:r>
-        <w:r>
-          <w:instrText xml:space="preserve">" </w:instrText>
-        </w:r>
-        <w:r>
+          <w:rPr>
+            <w:rFonts w:ascii="Times New Roman" w:hAnsi="Times New Roman" w:cs="Times New Roman"/>
+            <w:rPrChange w:id="151" w:author="HP" w:date="2026-03-20T14:55:00Z">
+              <w:rPr/>
+            </w:rPrChange>
+          </w:rPr>
+          <w:instrText xml:space="preserve"> HYPERLINK "https://vbpl.vn/pages/portal.aspx" </w:instrText>
+        </w:r>
+        <w:r>
+          <w:rPr>
+            <w:rFonts w:ascii="Times New Roman" w:hAnsi="Times New Roman" w:cs="Times New Roman"/>
+            <w:rPrChange w:id="152" w:author="HP" w:date="2026-03-20T14:55:00Z">
+              <w:rPr/>
+            </w:rPrChange>
+          </w:rPr>
           <w:fldChar w:fldCharType="separate"/>
         </w:r>
         <w:r>
           <w:rPr>
             <w:rStyle w:val="Hyperlink"/>
+            <w:rFonts w:ascii="Times New Roman" w:hAnsi="Times New Roman" w:cs="Times New Roman"/>
+            <w:rPrChange w:id="153" w:author="HP" w:date="2026-03-20T14:55:00Z">
+              <w:rPr>
+                <w:rStyle w:val="Hyperlink"/>
+              </w:rPr>
+            </w:rPrChange>
           </w:rPr>
           <w:t>https://vbpl.vn/pages/portal.aspx</w:t>
         </w:r>
         <w:r>
+          <w:rPr>
+            <w:rFonts w:ascii="Times New Roman" w:hAnsi="Times New Roman" w:cs="Times New Roman"/>
+            <w:rPrChange w:id="154" w:author="HP" w:date="2026-03-20T14:55:00Z">
+              <w:rPr/>
+            </w:rPrChange>
+          </w:rPr>
           <w:fldChar w:fldCharType="end"/>
         </w:r>
         <w:r>
+          <w:rPr>
+            <w:rFonts w:ascii="Times New Roman" w:hAnsi="Times New Roman" w:cs="Times New Roman"/>
+            <w:rPrChange w:id="155" w:author="HP" w:date="2026-03-20T14:55:00Z">
+              <w:rPr/>
+            </w:rPrChange>
+          </w:rPr>
           <w:t xml:space="preserve">) </w:t>
         </w:r>
       </w:ins>
-      <w:ins w:id="20" w:author="HP" w:date="2026-03-19T10:14:00Z">
-        <w:r>
+      <w:ins w:id="156" w:author="HP" w:date="2026-03-19T10:14:00Z">
+        <w:r>
+          <w:rPr>
+            <w:rFonts w:ascii="Times New Roman" w:hAnsi="Times New Roman" w:cs="Times New Roman"/>
+            <w:rPrChange w:id="157" w:author="HP" w:date="2026-03-20T14:55:00Z">
+              <w:rPr/>
+            </w:rPrChange>
+          </w:rPr>
           <w:t>and VietNamese Minstry of</w:t>
         </w:r>
       </w:ins>
-      <w:ins w:id="21" w:author="HP" w:date="2026-03-19T10:35:00Z">
-        <w:r>
+      <w:ins w:id="158" w:author="HP" w:date="2026-03-19T10:35:00Z">
+        <w:r>
+          <w:rPr>
+            <w:rFonts w:ascii="Times New Roman" w:hAnsi="Times New Roman" w:cs="Times New Roman"/>
+            <w:rPrChange w:id="159" w:author="HP" w:date="2026-03-20T14:55:00Z">
+              <w:rPr/>
+            </w:rPrChange>
+          </w:rPr>
           <w:t xml:space="preserve"> </w:t>
         </w:r>
       </w:ins>
-      <w:ins w:id="22" w:author="HP" w:date="2026-03-19T10:14:00Z">
-        <w:r>
+      <w:ins w:id="160" w:author="HP" w:date="2026-03-19T10:14:00Z">
+        <w:r>
+          <w:rPr>
+            <w:rFonts w:ascii="Times New Roman" w:hAnsi="Times New Roman" w:cs="Times New Roman"/>
+            <w:rPrChange w:id="161" w:author="HP" w:date="2026-03-20T14:55:00Z">
+              <w:rPr/>
+            </w:rPrChange>
+          </w:rPr>
           <w:t>Transport(</w:t>
         </w:r>
       </w:ins>
-      <w:ins w:id="23" w:author="HP" w:date="2026-03-19T10:19:00Z">
-        <w:r>
-          <w:rPr>
-            <w:rFonts w:ascii="Roboto" w:eastAsia="Times New Roman" w:hAnsi="Roboto" w:cs="Arial"/>
+      <w:ins w:id="162" w:author="HP" w:date="2026-03-19T10:19:00Z">
+        <w:r>
+          <w:rPr>
+            <w:rFonts w:ascii="Times New Roman" w:eastAsia="Times New Roman" w:hAnsi="Times New Roman" w:cs="Times New Roman"/>
             <w:color w:val="0084F3"/>
             <w:kern w:val="0"/>
-            <w:sz w:val="23"/>
-            <w:szCs w:val="23"/>
             <w:u w:val="single"/>
             <w14:ligatures w14:val="none"/>
+            <w:rPrChange w:id="163" w:author="HP" w:date="2026-03-20T14:55:00Z">
+              <w:rPr>
+                <w:rFonts w:ascii="Roboto" w:eastAsia="Times New Roman" w:hAnsi="Roboto" w:cs="Arial"/>
+                <w:color w:val="0084F3"/>
+                <w:kern w:val="0"/>
+                <w:sz w:val="23"/>
+                <w:szCs w:val="23"/>
+                <w:u w:val="single"/>
+                <w14:ligatures w14:val="none"/>
+              </w:rPr>
+            </w:rPrChange>
           </w:rPr>
           <w:fldChar w:fldCharType="begin"/>
         </w:r>
         <w:r>
           <w:rPr>
-            <w:rFonts w:ascii="Roboto" w:eastAsia="Times New Roman" w:hAnsi="Roboto" w:cs="Arial"/>
+            <w:rFonts w:ascii="Times New Roman" w:eastAsia="Times New Roman" w:hAnsi="Times New Roman" w:cs="Times New Roman"/>
             <w:color w:val="0084F3"/>
             <w:kern w:val="0"/>
-            <w:sz w:val="23"/>
-            <w:szCs w:val="23"/>
             <w:u w:val="single"/>
             <w14:ligatures w14:val="none"/>
+            <w:rPrChange w:id="164" w:author="HP" w:date="2026-03-20T14:55:00Z">
+              <w:rPr>
+                <w:rFonts w:ascii="Roboto" w:eastAsia="Times New Roman" w:hAnsi="Roboto" w:cs="Arial"/>
+                <w:color w:val="0084F3"/>
+                <w:kern w:val="0"/>
+                <w:sz w:val="23"/>
+                <w:szCs w:val="23"/>
+                <w:u w:val="single"/>
+                <w14:ligatures w14:val="none"/>
+              </w:rPr>
+            </w:rPrChange>
           </w:rPr>
           <w:instrText xml:space="preserve"> HYPERLINK "</w:instrText>
         </w:r>
       </w:ins>
-      <w:ins w:id="24" w:author="HP" w:date="2026-03-19T10:15:00Z">
-        <w:r>
-          <w:rPr>
-            <w:rFonts w:ascii="Roboto" w:eastAsia="Times New Roman" w:hAnsi="Roboto" w:cs="Arial"/>
+      <w:ins w:id="165" w:author="HP" w:date="2026-03-19T10:15:00Z">
+        <w:r>
+          <w:rPr>
+            <w:rFonts w:ascii="Times New Roman" w:eastAsia="Times New Roman" w:hAnsi="Times New Roman" w:cs="Times New Roman"/>
             <w:color w:val="0084F3"/>
             <w:kern w:val="0"/>
-            <w:sz w:val="23"/>
-            <w:szCs w:val="23"/>
             <w:u w:val="single"/>
             <w14:ligatures w14:val="none"/>
+            <w:rPrChange w:id="166" w:author="HP" w:date="2026-03-20T14:55:00Z">
+              <w:rPr>
+                <w:rFonts w:ascii="Roboto" w:eastAsia="Times New Roman" w:hAnsi="Roboto" w:cs="Arial"/>
+                <w:color w:val="0084F3"/>
+                <w:kern w:val="0"/>
+                <w:sz w:val="23"/>
+                <w:szCs w:val="23"/>
+                <w:u w:val="single"/>
+                <w14:ligatures w14:val="none"/>
+              </w:rPr>
+            </w:rPrChange>
           </w:rPr>
           <w:instrText>http://www.mt.gov.vn</w:instrText>
         </w:r>
       </w:ins>
-      <w:ins w:id="25" w:author="HP" w:date="2026-03-19T10:19:00Z">
-        <w:r>
-          <w:rPr>
-            <w:rFonts w:ascii="Roboto" w:eastAsia="Times New Roman" w:hAnsi="Roboto" w:cs="Arial"/>
+      <w:ins w:id="167" w:author="HP" w:date="2026-03-19T10:19:00Z">
+        <w:r>
+          <w:rPr>
+            <w:rFonts w:ascii="Times New Roman" w:eastAsia="Times New Roman" w:hAnsi="Times New Roman" w:cs="Times New Roman"/>
             <w:color w:val="0084F3"/>
             <w:kern w:val="0"/>
-            <w:sz w:val="23"/>
-            <w:szCs w:val="23"/>
             <w:u w:val="single"/>
             <w14:ligatures w14:val="none"/>
+            <w:rPrChange w:id="168" w:author="HP" w:date="2026-03-20T14:55:00Z">
+              <w:rPr>
+                <w:rFonts w:ascii="Roboto" w:eastAsia="Times New Roman" w:hAnsi="Roboto" w:cs="Arial"/>
+                <w:color w:val="0084F3"/>
+                <w:kern w:val="0"/>
+                <w:sz w:val="23"/>
+                <w:szCs w:val="23"/>
+                <w:u w:val="single"/>
+                <w14:ligatures w14:val="none"/>
+              </w:rPr>
+            </w:rPrChange>
           </w:rPr>
           <w:instrText xml:space="preserve">" </w:instrText>
         </w:r>
         <w:r>
           <w:rPr>
-            <w:rFonts w:ascii="Roboto" w:eastAsia="Times New Roman" w:hAnsi="Roboto" w:cs="Arial"/>
+            <w:rFonts w:ascii="Times New Roman" w:eastAsia="Times New Roman" w:hAnsi="Times New Roman" w:cs="Times New Roman"/>
             <w:color w:val="0084F3"/>
             <w:kern w:val="0"/>
-            <w:sz w:val="23"/>
-            <w:szCs w:val="23"/>
             <w:u w:val="single"/>
             <w14:ligatures w14:val="none"/>
+            <w:rPrChange w:id="169" w:author="HP" w:date="2026-03-20T14:55:00Z">
+              <w:rPr>
+                <w:rFonts w:ascii="Roboto" w:eastAsia="Times New Roman" w:hAnsi="Roboto" w:cs="Arial"/>
+                <w:color w:val="0084F3"/>
+                <w:kern w:val="0"/>
+                <w:sz w:val="23"/>
+                <w:szCs w:val="23"/>
+                <w:u w:val="single"/>
+                <w14:ligatures w14:val="none"/>
+              </w:rPr>
+            </w:rPrChange>
           </w:rPr>
           <w:fldChar w:fldCharType="separate"/>
         </w:r>
       </w:ins>
-      <w:ins w:id="26" w:author="HP" w:date="2026-03-19T10:15:00Z">
+      <w:ins w:id="170" w:author="HP" w:date="2026-03-19T10:15:00Z">
         <w:r>
           <w:rPr>
             <w:rStyle w:val="Hyperlink"/>
-            <w:rFonts w:ascii="Roboto" w:eastAsia="Times New Roman" w:hAnsi="Roboto" w:cs="Arial"/>
+            <w:rFonts w:ascii="Times New Roman" w:eastAsia="Times New Roman" w:hAnsi="Times New Roman" w:cs="Times New Roman"/>
             <w:kern w:val="0"/>
-            <w:sz w:val="23"/>
-            <w:szCs w:val="23"/>
             <w14:ligatures w14:val="none"/>
+            <w:rPrChange w:id="171" w:author="HP" w:date="2026-03-20T14:55:00Z">
+              <w:rPr>
+                <w:rStyle w:val="Hyperlink"/>
+                <w:rFonts w:ascii="Roboto" w:eastAsia="Times New Roman" w:hAnsi="Roboto" w:cs="Arial"/>
+                <w:kern w:val="0"/>
+                <w:sz w:val="23"/>
+                <w:szCs w:val="23"/>
+                <w14:ligatures w14:val="none"/>
+              </w:rPr>
+            </w:rPrChange>
           </w:rPr>
           <w:t>http://www.mt.gov.vn</w:t>
         </w:r>
       </w:ins>
-      <w:ins w:id="27" w:author="HP" w:date="2026-03-19T10:19:00Z">
-        <w:r>
-          <w:rPr>
-            <w:rFonts w:ascii="Roboto" w:eastAsia="Times New Roman" w:hAnsi="Roboto" w:cs="Arial"/>
+      <w:ins w:id="172" w:author="HP" w:date="2026-03-19T10:19:00Z">
+        <w:r>
+          <w:rPr>
+            <w:rFonts w:ascii="Times New Roman" w:eastAsia="Times New Roman" w:hAnsi="Times New Roman" w:cs="Times New Roman"/>
             <w:color w:val="0084F3"/>
             <w:kern w:val="0"/>
-            <w:sz w:val="23"/>
-            <w:szCs w:val="23"/>
             <w:u w:val="single"/>
             <w14:ligatures w14:val="none"/>
+            <w:rPrChange w:id="173" w:author="HP" w:date="2026-03-20T14:55:00Z">
+              <w:rPr>
+                <w:rFonts w:ascii="Roboto" w:eastAsia="Times New Roman" w:hAnsi="Roboto" w:cs="Arial"/>
+                <w:color w:val="0084F3"/>
+                <w:kern w:val="0"/>
+                <w:sz w:val="23"/>
+                <w:szCs w:val="23"/>
+                <w:u w:val="single"/>
+                <w14:ligatures w14:val="none"/>
+              </w:rPr>
+            </w:rPrChange>
           </w:rPr>
           <w:fldChar w:fldCharType="end"/>
         </w:r>
       </w:ins>
-      <w:ins w:id="28" w:author="HP" w:date="2026-03-19T10:15:00Z">
-        <w:r>
-          <w:rPr>
-            <w:rFonts w:ascii="Roboto" w:eastAsia="Times New Roman" w:hAnsi="Roboto" w:cs="Arial"/>
+      <w:ins w:id="174" w:author="HP" w:date="2026-03-19T10:15:00Z">
+        <w:r>
+          <w:rPr>
+            <w:rFonts w:ascii="Times New Roman" w:eastAsia="Times New Roman" w:hAnsi="Times New Roman" w:cs="Times New Roman"/>
             <w:color w:val="62748D"/>
             <w:kern w:val="0"/>
-            <w:sz w:val="23"/>
-            <w:szCs w:val="23"/>
             <w14:ligatures w14:val="none"/>
-          </w:rPr>
-          <w:t>)</w:t>
-        </w:r>
-      </w:ins>
-      <w:ins w:id="29" w:author="HP" w:date="2026-03-19T10:19:00Z">
-        <w:r>
-          <w:rPr>
-            <w:rFonts w:ascii="Roboto" w:eastAsia="Times New Roman" w:hAnsi="Roboto" w:cs="Arial"/>
-            <w:color w:val="62748D"/>
-            <w:kern w:val="0"/>
-            <w:sz w:val="23"/>
-            <w:szCs w:val="23"/>
-            <w14:ligatures w14:val="none"/>
-          </w:rPr>
-          <w:t xml:space="preserve">, </w:t>
-        </w:r>
-        <w:r>
-          <w:rPr>
-            <w:rFonts w:ascii="Roboto" w:eastAsia="Times New Roman" w:hAnsi="Roboto" w:cs="Arial"/>
-            <w:color w:val="000000" w:themeColor="text1"/>
-            <w:kern w:val="0"/>
-            <w:sz w:val="23"/>
-            <w:szCs w:val="23"/>
-            <w14:ligatures w14:val="none"/>
-            <w:rPrChange w:id="30" w:author="HP" w:date="2026-03-19T10:20:00Z">
+            <w:rPrChange w:id="175" w:author="HP" w:date="2026-03-20T14:55:00Z">
               <w:rPr>
                 <w:rFonts w:ascii="Roboto" w:eastAsia="Times New Roman" w:hAnsi="Roboto" w:cs="Arial"/>
                 <w:color w:val="62748D"/>
@@ -1068,19 +1940,17 @@
               </w:rPr>
             </w:rPrChange>
           </w:rPr>
-          <w:t>dataset for this projec</w:t>
-        </w:r>
-      </w:ins>
-      <w:ins w:id="31" w:author="HP" w:date="2026-03-19T10:20:00Z">
-        <w:r>
-          <w:rPr>
-            <w:rFonts w:ascii="Roboto" w:eastAsia="Times New Roman" w:hAnsi="Roboto" w:cs="Arial"/>
-            <w:color w:val="000000" w:themeColor="text1"/>
+          <w:t>)</w:t>
+        </w:r>
+      </w:ins>
+      <w:ins w:id="176" w:author="HP" w:date="2026-03-19T10:19:00Z">
+        <w:r>
+          <w:rPr>
+            <w:rFonts w:ascii="Times New Roman" w:eastAsia="Times New Roman" w:hAnsi="Times New Roman" w:cs="Times New Roman"/>
+            <w:color w:val="62748D"/>
             <w:kern w:val="0"/>
-            <w:sz w:val="23"/>
-            <w:szCs w:val="23"/>
             <w14:ligatures w14:val="none"/>
-            <w:rPrChange w:id="32" w:author="HP" w:date="2026-03-19T10:20:00Z">
+            <w:rPrChange w:id="177" w:author="HP" w:date="2026-03-20T14:55:00Z">
               <w:rPr>
                 <w:rFonts w:ascii="Roboto" w:eastAsia="Times New Roman" w:hAnsi="Roboto" w:cs="Arial"/>
                 <w:color w:val="62748D"/>
@@ -1091,16 +1961,64 @@
               </w:rPr>
             </w:rPrChange>
           </w:rPr>
+          <w:t xml:space="preserve">, </w:t>
+        </w:r>
+        <w:r>
+          <w:rPr>
+            <w:rFonts w:ascii="Times New Roman" w:eastAsia="Times New Roman" w:hAnsi="Times New Roman" w:cs="Times New Roman"/>
+            <w:color w:val="000000" w:themeColor="text1"/>
+            <w:kern w:val="0"/>
+            <w14:ligatures w14:val="none"/>
+            <w:rPrChange w:id="178" w:author="HP" w:date="2026-03-20T14:55:00Z">
+              <w:rPr>
+                <w:rFonts w:ascii="Roboto" w:eastAsia="Times New Roman" w:hAnsi="Roboto" w:cs="Arial"/>
+                <w:color w:val="62748D"/>
+                <w:kern w:val="0"/>
+                <w:sz w:val="23"/>
+                <w:szCs w:val="23"/>
+                <w14:ligatures w14:val="none"/>
+              </w:rPr>
+            </w:rPrChange>
+          </w:rPr>
+          <w:t>dataset for this projec</w:t>
+        </w:r>
+      </w:ins>
+      <w:ins w:id="179" w:author="HP" w:date="2026-03-19T10:20:00Z">
+        <w:r>
+          <w:rPr>
+            <w:rFonts w:ascii="Times New Roman" w:eastAsia="Times New Roman" w:hAnsi="Times New Roman" w:cs="Times New Roman"/>
+            <w:color w:val="000000" w:themeColor="text1"/>
+            <w:kern w:val="0"/>
+            <w14:ligatures w14:val="none"/>
+            <w:rPrChange w:id="180" w:author="HP" w:date="2026-03-20T14:55:00Z">
+              <w:rPr>
+                <w:rFonts w:ascii="Roboto" w:eastAsia="Times New Roman" w:hAnsi="Roboto" w:cs="Arial"/>
+                <w:color w:val="62748D"/>
+                <w:kern w:val="0"/>
+                <w:sz w:val="23"/>
+                <w:szCs w:val="23"/>
+                <w14:ligatures w14:val="none"/>
+              </w:rPr>
+            </w:rPrChange>
+          </w:rPr>
           <w:t xml:space="preserve">t include </w:t>
         </w:r>
         <w:r>
           <w:rPr>
-            <w:rFonts w:ascii="Roboto" w:eastAsia="Times New Roman" w:hAnsi="Roboto" w:cs="Arial"/>
+            <w:rFonts w:ascii="Times New Roman" w:eastAsia="Times New Roman" w:hAnsi="Times New Roman" w:cs="Times New Roman"/>
             <w:color w:val="62748D"/>
             <w:kern w:val="0"/>
-            <w:sz w:val="23"/>
-            <w:szCs w:val="23"/>
             <w14:ligatures w14:val="none"/>
+            <w:rPrChange w:id="181" w:author="HP" w:date="2026-03-20T14:55:00Z">
+              <w:rPr>
+                <w:rFonts w:ascii="Roboto" w:eastAsia="Times New Roman" w:hAnsi="Roboto" w:cs="Arial"/>
+                <w:color w:val="62748D"/>
+                <w:kern w:val="0"/>
+                <w:sz w:val="23"/>
+                <w:szCs w:val="23"/>
+                <w14:ligatures w14:val="none"/>
+              </w:rPr>
+            </w:rPrChange>
           </w:rPr>
           <w:t>:</w:t>
         </w:r>
@@ -1109,205 +2027,284 @@
     <w:p>
       <w:pPr>
         <w:rPr>
-          <w:ins w:id="33" w:author="HP" w:date="2026-03-19T10:21:00Z"/>
-        </w:rPr>
-      </w:pPr>
-      <w:ins w:id="34" w:author="HP" w:date="2026-03-19T10:21:00Z">
-        <w:r>
-          <w:t>- Thư viện pháp luật :</w:t>
-        </w:r>
-      </w:ins>
-    </w:p>
-    <w:p>
-      <w:pPr>
-        <w:rPr>
-          <w:ins w:id="35" w:author="HP" w:date="2026-03-19T10:21:00Z"/>
-        </w:rPr>
-      </w:pPr>
-      <w:ins w:id="36" w:author="HP" w:date="2026-03-19T10:21:00Z">
-        <w:r>
-          <w:t>+ sign_code :</w:t>
-        </w:r>
-      </w:ins>
-    </w:p>
-    <w:p>
-      <w:pPr>
-        <w:rPr>
-          <w:ins w:id="37" w:author="HP" w:date="2026-03-19T10:21:00Z"/>
-        </w:rPr>
-      </w:pPr>
-      <w:ins w:id="38" w:author="HP" w:date="2026-03-19T10:21:00Z">
-        <w:r>
-          <w:t>+ sign_name :</w:t>
-        </w:r>
-      </w:ins>
-    </w:p>
-    <w:p>
-      <w:pPr>
-        <w:rPr>
-          <w:ins w:id="39" w:author="HP" w:date="2026-03-19T10:21:00Z"/>
-        </w:rPr>
-      </w:pPr>
-      <w:ins w:id="40" w:author="HP" w:date="2026-03-19T10:21:00Z">
-        <w:r>
-          <w:t>+ sign_type :</w:t>
-        </w:r>
-      </w:ins>
-    </w:p>
-    <w:p>
-      <w:pPr>
-        <w:rPr>
-          <w:ins w:id="41" w:author="HP" w:date="2026-03-19T10:32:00Z"/>
-        </w:rPr>
-      </w:pPr>
-      <w:ins w:id="42" w:author="HP" w:date="2026-03-19T10:22:00Z">
-        <w:r>
-          <w:t>+ description :</w:t>
-        </w:r>
-      </w:ins>
-    </w:p>
-    <w:p>
-      <w:pPr>
-        <w:rPr>
-          <w:ins w:id="43" w:author="HP" w:date="2026-03-19T10:32:00Z"/>
-        </w:rPr>
-      </w:pPr>
-      <w:ins w:id="44" w:author="HP" w:date="2026-03-19T10:32:00Z">
-        <w:r>
-          <w:t xml:space="preserve">Ex : </w:t>
-        </w:r>
-      </w:ins>
-    </w:p>
-    <w:p>
-      <w:pPr>
-        <w:rPr>
-          <w:ins w:id="45" w:author="HP" w:date="2026-03-19T10:33:00Z"/>
-        </w:rPr>
-      </w:pPr>
-      <w:ins w:id="46" w:author="HP" w:date="2026-03-19T10:32:00Z">
-        <w:r>
-          <w:t xml:space="preserve">P.124 : </w:t>
-        </w:r>
-      </w:ins>
-      <w:ins w:id="47" w:author="HP" w:date="2026-03-19T10:33:00Z">
-        <w:r>
-          <w:t>Right turn Alowed</w:t>
-        </w:r>
-      </w:ins>
-    </w:p>
-    <w:p>
-      <w:pPr>
-        <w:rPr>
-          <w:ins w:id="48" w:author="HP" w:date="2026-03-19T10:22:00Z"/>
-        </w:rPr>
-      </w:pPr>
-      <w:ins w:id="49" w:author="HP" w:date="2026-03-19T10:33:00Z">
-        <w:r>
-          <w:t>P.407 : 1 way</w:t>
-        </w:r>
-      </w:ins>
-      <w:ins w:id="50" w:author="HP" w:date="2026-03-19T10:34:00Z">
-        <w:r>
-          <w:t xml:space="preserve"> road</w:t>
-        </w:r>
-      </w:ins>
-    </w:p>
-    <w:p>
-      <w:pPr>
-        <w:rPr>
-          <w:ins w:id="51" w:author="HP" w:date="2026-03-19T10:34:00Z"/>
-        </w:rPr>
-      </w:pPr>
-      <w:ins w:id="52" w:author="HP" w:date="2026-03-19T10:34:00Z">
-        <w:r>
-          <w:t>-</w:t>
-        </w:r>
-        <w:r>
-          <w:t xml:space="preserve"> </w:t>
-        </w:r>
-        <w:r>
-          <w:t>National Databases about Law :</w:t>
-        </w:r>
-      </w:ins>
-    </w:p>
-    <w:p>
-      <w:pPr>
-        <w:rPr>
-          <w:ins w:id="53" w:author="HP" w:date="2026-03-19T10:34:00Z"/>
-        </w:rPr>
-      </w:pPr>
-      <w:ins w:id="54" w:author="HP" w:date="2026-03-19T10:34:00Z">
-        <w:r>
-          <w:t>+ licences_type :</w:t>
-        </w:r>
-      </w:ins>
-    </w:p>
-    <w:p>
-      <w:pPr>
-        <w:rPr>
-          <w:ins w:id="55" w:author="HP" w:date="2026-03-19T10:35:00Z"/>
-        </w:rPr>
-      </w:pPr>
-      <w:ins w:id="56" w:author="HP" w:date="2026-03-19T10:34:00Z">
-        <w:r>
-          <w:t>+ age_requirem</w:t>
-        </w:r>
-      </w:ins>
-      <w:ins w:id="57" w:author="HP" w:date="2026-03-19T10:35:00Z">
-        <w:r>
-          <w:t>ent :</w:t>
-        </w:r>
-      </w:ins>
-    </w:p>
-    <w:p>
-      <w:pPr>
-        <w:rPr>
-          <w:ins w:id="58" w:author="HP" w:date="2026-03-19T10:35:00Z"/>
-        </w:rPr>
-      </w:pPr>
-      <w:ins w:id="59" w:author="HP" w:date="2026-03-19T10:35:00Z">
-        <w:r>
-          <w:t>+ condition :</w:t>
-        </w:r>
-      </w:ins>
-    </w:p>
-    <w:p>
-      <w:pPr>
-        <w:rPr>
-          <w:ins w:id="60" w:author="HP" w:date="2026-03-19T10:35:00Z"/>
-        </w:rPr>
-      </w:pPr>
-      <w:ins w:id="61" w:author="HP" w:date="2026-03-19T10:35:00Z">
-        <w:r>
-          <w:t>Ex :</w:t>
-        </w:r>
-      </w:ins>
-    </w:p>
-    <w:p>
-      <w:pPr>
-        <w:rPr>
-          <w:ins w:id="62" w:author="HP" w:date="2026-03-19T10:35:00Z"/>
-        </w:rPr>
-      </w:pPr>
-      <w:ins w:id="63" w:author="HP" w:date="2026-03-19T10:35:00Z">
-        <w:r>
-          <w:t xml:space="preserve">A1 , A2 , B1, B2 </w:t>
-        </w:r>
-      </w:ins>
-    </w:p>
-    <w:p>
-      <w:pPr>
-        <w:rPr>
-          <w:del w:id="64" w:author="HP" w:date="2026-03-19T10:35:00Z"/>
-        </w:rPr>
-      </w:pPr>
-    </w:p>
-    <w:p>
-      <w:pPr>
-        <w:rPr>
-          <w:ins w:id="65" w:author="HP" w:date="2026-03-19T10:34:00Z"/>
-        </w:rPr>
-        <w:pPrChange w:id="66" w:author="HP" w:date="2026-03-19T10:35:00Z">
+          <w:ins w:id="182" w:author="HP" w:date="2026-03-19T10:21:00Z"/>
+          <w:rFonts w:ascii="Times New Roman" w:hAnsi="Times New Roman" w:cs="Times New Roman"/>
+          <w:rPrChange w:id="183" w:author="HP" w:date="2026-03-20T14:55:00Z">
+            <w:rPr>
+              <w:ins w:id="184" w:author="HP" w:date="2026-03-19T10:21:00Z"/>
+            </w:rPr>
+          </w:rPrChange>
+        </w:rPr>
+      </w:pPr>
+      <w:ins w:id="185" w:author="HP" w:date="2026-03-20T14:46:00Z">
+        <w:r>
+          <w:rPr>
+            <w:rFonts w:ascii="Times New Roman" w:hAnsi="Times New Roman" w:cs="Times New Roman"/>
+            <w:rPrChange w:id="186" w:author="HP" w:date="2026-03-20T14:55:00Z">
+              <w:rPr/>
+            </w:rPrChange>
+          </w:rPr>
+          <w:t xml:space="preserve">2.2.1 </w:t>
+        </w:r>
+      </w:ins>
+      <w:ins w:id="187" w:author="HP" w:date="2026-03-19T10:21:00Z">
+        <w:r>
+          <w:rPr>
+            <w:rFonts w:ascii="Times New Roman" w:hAnsi="Times New Roman" w:cs="Times New Roman"/>
+            <w:rPrChange w:id="188" w:author="HP" w:date="2026-03-20T14:55:00Z">
+              <w:rPr/>
+            </w:rPrChange>
+          </w:rPr>
+          <w:t>Thư viện pháp luật</w:t>
+        </w:r>
+      </w:ins>
+      <w:ins w:id="189" w:author="HP" w:date="2026-03-20T14:46:00Z">
+        <w:r>
+          <w:rPr>
+            <w:rFonts w:ascii="Times New Roman" w:hAnsi="Times New Roman" w:cs="Times New Roman"/>
+            <w:rPrChange w:id="190" w:author="HP" w:date="2026-03-20T14:55:00Z">
+              <w:rPr/>
+            </w:rPrChange>
+          </w:rPr>
+          <w:t xml:space="preserve"> Datas</w:t>
+        </w:r>
+      </w:ins>
+      <w:ins w:id="191" w:author="HP" w:date="2026-03-20T14:47:00Z">
+        <w:r>
+          <w:rPr>
+            <w:rFonts w:ascii="Times New Roman" w:hAnsi="Times New Roman" w:cs="Times New Roman"/>
+            <w:rPrChange w:id="192" w:author="HP" w:date="2026-03-20T14:55:00Z">
+              <w:rPr/>
+            </w:rPrChange>
+          </w:rPr>
+          <w:t>et</w:t>
+        </w:r>
+      </w:ins>
+      <w:ins w:id="193" w:author="HP" w:date="2026-03-19T10:21:00Z">
+        <w:r>
+          <w:rPr>
+            <w:rFonts w:ascii="Times New Roman" w:hAnsi="Times New Roman" w:cs="Times New Roman"/>
+            <w:rPrChange w:id="194" w:author="HP" w:date="2026-03-20T14:55:00Z">
+              <w:rPr/>
+            </w:rPrChange>
+          </w:rPr>
+          <w:t xml:space="preserve"> :</w:t>
+        </w:r>
+      </w:ins>
+    </w:p>
+    <w:p>
+      <w:pPr>
+        <w:rPr>
+          <w:ins w:id="195" w:author="HP" w:date="2026-03-20T14:46:00Z"/>
+          <w:rFonts w:ascii="Times New Roman" w:hAnsi="Times New Roman" w:cs="Times New Roman"/>
+          <w:rPrChange w:id="196" w:author="HP" w:date="2026-03-20T14:55:00Z">
+            <w:rPr>
+              <w:ins w:id="197" w:author="HP" w:date="2026-03-20T14:46:00Z"/>
+            </w:rPr>
+          </w:rPrChange>
+        </w:rPr>
+      </w:pPr>
+      <w:ins w:id="198" w:author="HP" w:date="2026-03-20T14:46:00Z">
+        <w:r>
+          <w:rPr>
+            <w:rFonts w:ascii="Times New Roman" w:hAnsi="Times New Roman" w:cs="Times New Roman"/>
+            <w:rPrChange w:id="199" w:author="HP" w:date="2026-03-20T14:55:00Z">
+              <w:rPr/>
+            </w:rPrChange>
+          </w:rPr>
+          <w:t>Structure:</w:t>
+        </w:r>
+        <w:r>
+          <w:rPr>
+            <w:rFonts w:ascii="Times New Roman" w:hAnsi="Times New Roman" w:cs="Times New Roman"/>
+            <w:rPrChange w:id="200" w:author="HP" w:date="2026-03-20T14:55:00Z">
+              <w:rPr/>
+            </w:rPrChange>
+          </w:rPr>
+          <w:br/>
+          <w:t>- chapter</w:t>
+        </w:r>
+        <w:r>
+          <w:rPr>
+            <w:rFonts w:ascii="Times New Roman" w:hAnsi="Times New Roman" w:cs="Times New Roman"/>
+            <w:rPrChange w:id="201" w:author="HP" w:date="2026-03-20T14:55:00Z">
+              <w:rPr/>
+            </w:rPrChange>
+          </w:rPr>
+          <w:br/>
+          <w:t>- article</w:t>
+        </w:r>
+        <w:r>
+          <w:rPr>
+            <w:rFonts w:ascii="Times New Roman" w:hAnsi="Times New Roman" w:cs="Times New Roman"/>
+            <w:rPrChange w:id="202" w:author="HP" w:date="2026-03-20T14:55:00Z">
+              <w:rPr/>
+            </w:rPrChange>
+          </w:rPr>
+          <w:br/>
+          <w:t>- content</w:t>
+        </w:r>
+      </w:ins>
+    </w:p>
+    <w:p>
+      <w:pPr>
+        <w:rPr>
+          <w:ins w:id="203" w:author="HP" w:date="2026-03-20T14:46:00Z"/>
+          <w:rFonts w:ascii="Times New Roman" w:hAnsi="Times New Roman" w:cs="Times New Roman"/>
+          <w:rPrChange w:id="204" w:author="HP" w:date="2026-03-20T14:55:00Z">
+            <w:rPr>
+              <w:ins w:id="205" w:author="HP" w:date="2026-03-20T14:46:00Z"/>
+            </w:rPr>
+          </w:rPrChange>
+        </w:rPr>
+      </w:pPr>
+      <w:ins w:id="206" w:author="HP" w:date="2026-03-20T14:46:00Z">
+        <w:r>
+          <w:rPr>
+            <w:rFonts w:ascii="Times New Roman" w:hAnsi="Times New Roman" w:cs="Times New Roman"/>
+            <w:rPrChange w:id="207" w:author="HP" w:date="2026-03-20T14:55:00Z">
+              <w:rPr/>
+            </w:rPrChange>
+          </w:rPr>
+          <w:br/>
+          <w:t>Purpose:</w:t>
+        </w:r>
+        <w:r>
+          <w:rPr>
+            <w:rFonts w:ascii="Times New Roman" w:hAnsi="Times New Roman" w:cs="Times New Roman"/>
+            <w:rPrChange w:id="208" w:author="HP" w:date="2026-03-20T14:55:00Z">
+              <w:rPr/>
+            </w:rPrChange>
+          </w:rPr>
+          <w:br/>
+          <w:t>Used to answer general legal questions and provide official law references.</w:t>
+        </w:r>
+      </w:ins>
+    </w:p>
+    <w:p>
+      <w:pPr>
+        <w:rPr>
+          <w:ins w:id="209" w:author="HP" w:date="2026-03-19T10:34:00Z"/>
+          <w:rFonts w:ascii="Times New Roman" w:hAnsi="Times New Roman" w:cs="Times New Roman"/>
+          <w:rPrChange w:id="210" w:author="HP" w:date="2026-03-20T14:55:00Z">
+            <w:rPr>
+              <w:ins w:id="211" w:author="HP" w:date="2026-03-19T10:34:00Z"/>
+            </w:rPr>
+          </w:rPrChange>
+        </w:rPr>
+      </w:pPr>
+      <w:ins w:id="212" w:author="HP" w:date="2026-03-20T14:47:00Z">
+        <w:r>
+          <w:rPr>
+            <w:rFonts w:ascii="Times New Roman" w:hAnsi="Times New Roman" w:cs="Times New Roman"/>
+            <w:rPrChange w:id="213" w:author="HP" w:date="2026-03-20T14:55:00Z">
+              <w:rPr/>
+            </w:rPrChange>
+          </w:rPr>
+          <w:t>2.2.2</w:t>
+        </w:r>
+      </w:ins>
+      <w:ins w:id="214" w:author="HP" w:date="2026-03-19T10:34:00Z">
+        <w:r>
+          <w:rPr>
+            <w:rFonts w:ascii="Times New Roman" w:hAnsi="Times New Roman" w:cs="Times New Roman"/>
+            <w:rPrChange w:id="215" w:author="HP" w:date="2026-03-20T14:55:00Z">
+              <w:rPr/>
+            </w:rPrChange>
+          </w:rPr>
+          <w:t xml:space="preserve"> National Databases about Law</w:t>
+        </w:r>
+      </w:ins>
+      <w:ins w:id="216" w:author="HP" w:date="2026-03-20T14:47:00Z">
+        <w:r>
+          <w:rPr>
+            <w:rFonts w:ascii="Times New Roman" w:hAnsi="Times New Roman" w:cs="Times New Roman"/>
+            <w:rPrChange w:id="217" w:author="HP" w:date="2026-03-20T14:55:00Z">
+              <w:rPr/>
+            </w:rPrChange>
+          </w:rPr>
+          <w:t xml:space="preserve"> Dataset</w:t>
+        </w:r>
+        <w:r>
+          <w:rPr>
+            <w:rFonts w:ascii="Times New Roman" w:hAnsi="Times New Roman" w:cs="Times New Roman"/>
+            <w:rPrChange w:id="218" w:author="HP" w:date="2026-03-20T14:55:00Z">
+              <w:rPr/>
+            </w:rPrChange>
+          </w:rPr>
+          <w:tab/>
+        </w:r>
+      </w:ins>
+      <w:ins w:id="219" w:author="HP" w:date="2026-03-19T10:34:00Z">
+        <w:r>
+          <w:rPr>
+            <w:rFonts w:ascii="Times New Roman" w:hAnsi="Times New Roman" w:cs="Times New Roman"/>
+            <w:rPrChange w:id="220" w:author="HP" w:date="2026-03-20T14:55:00Z">
+              <w:rPr/>
+            </w:rPrChange>
+          </w:rPr>
+          <w:t xml:space="preserve"> :</w:t>
+        </w:r>
+      </w:ins>
+    </w:p>
+    <w:p>
+      <w:pPr>
+        <w:rPr>
+          <w:del w:id="221" w:author="HP" w:date="2026-03-19T10:35:00Z"/>
+          <w:rFonts w:ascii="Times New Roman" w:hAnsi="Times New Roman" w:cs="Times New Roman"/>
+          <w:rPrChange w:id="222" w:author="HP" w:date="2026-03-20T14:55:00Z">
+            <w:rPr>
+              <w:del w:id="223" w:author="HP" w:date="2026-03-19T10:35:00Z"/>
+            </w:rPr>
+          </w:rPrChange>
+        </w:rPr>
+      </w:pPr>
+      <w:ins w:id="224" w:author="HP" w:date="2026-03-20T14:47:00Z">
+        <w:r>
+          <w:rPr>
+            <w:rFonts w:ascii="Times New Roman" w:hAnsi="Times New Roman" w:cs="Times New Roman"/>
+            <w:rPrChange w:id="225" w:author="HP" w:date="2026-03-20T14:55:00Z">
+              <w:rPr/>
+            </w:rPrChange>
+          </w:rPr>
+          <w:t>Collected from:</w:t>
+        </w:r>
+        <w:r>
+          <w:rPr>
+            <w:rFonts w:ascii="Times New Roman" w:hAnsi="Times New Roman" w:cs="Times New Roman"/>
+            <w:rPrChange w:id="226" w:author="HP" w:date="2026-03-20T14:55:00Z">
+              <w:rPr/>
+            </w:rPrChange>
+          </w:rPr>
+          <w:br/>
+          <w:t>- Decree 100/2019/NĐ-CP</w:t>
+        </w:r>
+        <w:r>
+          <w:rPr>
+            <w:rFonts w:ascii="Times New Roman" w:hAnsi="Times New Roman" w:cs="Times New Roman"/>
+            <w:rPrChange w:id="227" w:author="HP" w:date="2026-03-20T14:55:00Z">
+              <w:rPr/>
+            </w:rPrChange>
+          </w:rPr>
+          <w:br/>
+          <w:t>- Decree 123/2021/NĐ-CP</w:t>
+        </w:r>
+      </w:ins>
+    </w:p>
+    <w:p>
+      <w:pPr>
+        <w:rPr>
+          <w:ins w:id="228" w:author="HP" w:date="2026-03-19T10:39:00Z"/>
+          <w:rFonts w:ascii="Times New Roman" w:hAnsi="Times New Roman" w:cs="Times New Roman"/>
+          <w:noProof/>
+          <w:rPrChange w:id="229" w:author="HP" w:date="2026-03-20T14:55:00Z">
+            <w:rPr>
+              <w:ins w:id="230" w:author="HP" w:date="2026-03-19T10:39:00Z"/>
+              <w:noProof/>
+            </w:rPr>
+          </w:rPrChange>
+        </w:rPr>
+        <w:pPrChange w:id="231" w:author="HP" w:date="2026-03-19T10:39:00Z">
           <w:pPr>
             <w:jc w:val="center"/>
           </w:pPr>
@@ -1317,49 +2314,335 @@
     <w:p>
       <w:pPr>
         <w:rPr>
-          <w:ins w:id="67" w:author="HP" w:date="2026-03-19T10:39:00Z"/>
+          <w:ins w:id="232" w:author="HP" w:date="2026-03-19T10:39:00Z"/>
+          <w:rFonts w:ascii="Times New Roman" w:hAnsi="Times New Roman" w:cs="Times New Roman"/>
           <w:noProof/>
-        </w:rPr>
-        <w:pPrChange w:id="68" w:author="HP" w:date="2026-03-19T10:39:00Z">
+          <w:rPrChange w:id="233" w:author="HP" w:date="2026-03-20T14:55:00Z">
+            <w:rPr>
+              <w:ins w:id="234" w:author="HP" w:date="2026-03-19T10:39:00Z"/>
+              <w:noProof/>
+            </w:rPr>
+          </w:rPrChange>
+        </w:rPr>
+        <w:pPrChange w:id="235" w:author="HP" w:date="2026-03-19T10:39:00Z">
           <w:pPr>
             <w:jc w:val="center"/>
           </w:pPr>
         </w:pPrChange>
       </w:pPr>
-    </w:p>
-    <w:p>
-      <w:pPr>
-        <w:rPr>
-          <w:ins w:id="69" w:author="HP" w:date="2026-03-19T10:39:00Z"/>
-          <w:noProof/>
-        </w:rPr>
-        <w:pPrChange w:id="70" w:author="HP" w:date="2026-03-19T10:39:00Z">
+      <w:ins w:id="236" w:author="HP" w:date="2026-03-20T14:47:00Z">
+        <w:r>
+          <w:rPr>
+            <w:rFonts w:ascii="Times New Roman" w:hAnsi="Times New Roman" w:cs="Times New Roman"/>
+            <w:rPrChange w:id="237" w:author="HP" w:date="2026-03-20T14:55:00Z">
+              <w:rPr/>
+            </w:rPrChange>
+          </w:rPr>
+          <w:t>Structure:</w:t>
+        </w:r>
+        <w:r>
+          <w:rPr>
+            <w:rFonts w:ascii="Times New Roman" w:hAnsi="Times New Roman" w:cs="Times New Roman"/>
+            <w:rPrChange w:id="238" w:author="HP" w:date="2026-03-20T14:55:00Z">
+              <w:rPr/>
+            </w:rPrChange>
+          </w:rPr>
+          <w:br/>
+          <w:t>- article</w:t>
+        </w:r>
+        <w:r>
+          <w:rPr>
+            <w:rFonts w:ascii="Times New Roman" w:hAnsi="Times New Roman" w:cs="Times New Roman"/>
+            <w:rPrChange w:id="239" w:author="HP" w:date="2026-03-20T14:55:00Z">
+              <w:rPr/>
+            </w:rPrChange>
+          </w:rPr>
+          <w:br/>
+          <w:t>- clause</w:t>
+        </w:r>
+        <w:r>
+          <w:rPr>
+            <w:rFonts w:ascii="Times New Roman" w:hAnsi="Times New Roman" w:cs="Times New Roman"/>
+            <w:rPrChange w:id="240" w:author="HP" w:date="2026-03-20T14:55:00Z">
+              <w:rPr/>
+            </w:rPrChange>
+          </w:rPr>
+          <w:br/>
+        </w:r>
+        <w:r>
+          <w:rPr>
+            <w:rFonts w:ascii="Times New Roman" w:hAnsi="Times New Roman" w:cs="Times New Roman"/>
+            <w:rPrChange w:id="241" w:author="HP" w:date="2026-03-20T14:55:00Z">
+              <w:rPr/>
+            </w:rPrChange>
+          </w:rPr>
+          <w:lastRenderedPageBreak/>
+          <w:t>- violation</w:t>
+        </w:r>
+        <w:r>
+          <w:rPr>
+            <w:rFonts w:ascii="Times New Roman" w:hAnsi="Times New Roman" w:cs="Times New Roman"/>
+            <w:rPrChange w:id="242" w:author="HP" w:date="2026-03-20T14:55:00Z">
+              <w:rPr/>
+            </w:rPrChange>
+          </w:rPr>
+          <w:br/>
+          <w:t>- vehicle_type</w:t>
+        </w:r>
+        <w:r>
+          <w:rPr>
+            <w:rFonts w:ascii="Times New Roman" w:hAnsi="Times New Roman" w:cs="Times New Roman"/>
+            <w:rPrChange w:id="243" w:author="HP" w:date="2026-03-20T14:55:00Z">
+              <w:rPr/>
+            </w:rPrChange>
+          </w:rPr>
+          <w:br/>
+          <w:t>- penalty</w:t>
+        </w:r>
+        <w:r>
+          <w:rPr>
+            <w:rFonts w:ascii="Times New Roman" w:hAnsi="Times New Roman" w:cs="Times New Roman"/>
+            <w:rPrChange w:id="244" w:author="HP" w:date="2026-03-20T14:55:00Z">
+              <w:rPr/>
+            </w:rPrChange>
+          </w:rPr>
+          <w:br/>
+        </w:r>
+        <w:r>
+          <w:rPr>
+            <w:rFonts w:ascii="Times New Roman" w:hAnsi="Times New Roman" w:cs="Times New Roman"/>
+            <w:rPrChange w:id="245" w:author="HP" w:date="2026-03-20T14:55:00Z">
+              <w:rPr/>
+            </w:rPrChange>
+          </w:rPr>
+          <w:br/>
+          <w:t>Purpose:</w:t>
+        </w:r>
+        <w:r>
+          <w:rPr>
+            <w:rFonts w:ascii="Times New Roman" w:hAnsi="Times New Roman" w:cs="Times New Roman"/>
+            <w:rPrChange w:id="246" w:author="HP" w:date="2026-03-20T14:55:00Z">
+              <w:rPr/>
+            </w:rPrChange>
+          </w:rPr>
+          <w:br/>
+          <w:t>Used for answering questions related to fines and violations.</w:t>
+        </w:r>
+      </w:ins>
+    </w:p>
+    <w:p>
+      <w:pPr>
+        <w:rPr>
+          <w:ins w:id="247" w:author="HP" w:date="2026-03-20T14:47:00Z"/>
+          <w:rFonts w:ascii="Times New Roman" w:hAnsi="Times New Roman" w:cs="Times New Roman"/>
+          <w:rPrChange w:id="248" w:author="HP" w:date="2026-03-20T14:55:00Z">
+            <w:rPr>
+              <w:ins w:id="249" w:author="HP" w:date="2026-03-20T14:47:00Z"/>
+            </w:rPr>
+          </w:rPrChange>
+        </w:rPr>
+        <w:pPrChange w:id="250" w:author="HP" w:date="2026-03-19T10:39:00Z">
           <w:pPr>
             <w:jc w:val="center"/>
           </w:pPr>
         </w:pPrChange>
       </w:pPr>
-    </w:p>
-    <w:p>
-      <w:pPr>
-        <w:rPr>
-          <w:ins w:id="71" w:author="HP" w:date="2026-03-19T10:39:00Z"/>
+      <w:ins w:id="251" w:author="HP" w:date="2026-03-20T14:47:00Z">
+        <w:r>
+          <w:rPr>
+            <w:rFonts w:ascii="Times New Roman" w:hAnsi="Times New Roman" w:cs="Times New Roman"/>
+            <w:noProof/>
+            <w:rPrChange w:id="252" w:author="HP" w:date="2026-03-20T14:55:00Z">
+              <w:rPr>
+                <w:noProof/>
+              </w:rPr>
+            </w:rPrChange>
+          </w:rPr>
+          <w:t xml:space="preserve">2.2.3 </w:t>
+        </w:r>
+        <w:r>
+          <w:rPr>
+            <w:rFonts w:ascii="Times New Roman" w:hAnsi="Times New Roman" w:cs="Times New Roman"/>
+            <w:rPrChange w:id="253" w:author="HP" w:date="2026-03-20T14:55:00Z">
+              <w:rPr/>
+            </w:rPrChange>
+          </w:rPr>
+          <w:t>Traffic Sign Dataset</w:t>
+        </w:r>
+      </w:ins>
+    </w:p>
+    <w:p>
+      <w:pPr>
+        <w:rPr>
+          <w:ins w:id="254" w:author="HP" w:date="2026-03-19T10:39:00Z"/>
+          <w:rFonts w:ascii="Times New Roman" w:hAnsi="Times New Roman" w:cs="Times New Roman"/>
           <w:noProof/>
-        </w:rPr>
-        <w:pPrChange w:id="72" w:author="HP" w:date="2026-03-19T10:39:00Z">
+          <w:rPrChange w:id="255" w:author="HP" w:date="2026-03-20T14:55:00Z">
+            <w:rPr>
+              <w:ins w:id="256" w:author="HP" w:date="2026-03-19T10:39:00Z"/>
+              <w:noProof/>
+            </w:rPr>
+          </w:rPrChange>
+        </w:rPr>
+        <w:pPrChange w:id="257" w:author="HP" w:date="2026-03-19T10:39:00Z">
           <w:pPr>
             <w:jc w:val="center"/>
           </w:pPr>
         </w:pPrChange>
       </w:pPr>
-    </w:p>
-    <w:p>
-      <w:pPr>
-        <w:rPr>
-          <w:ins w:id="73" w:author="HP" w:date="2026-03-19T10:39:00Z"/>
+      <w:ins w:id="258" w:author="HP" w:date="2026-03-20T14:47:00Z">
+        <w:r>
+          <w:rPr>
+            <w:rFonts w:ascii="Times New Roman" w:hAnsi="Times New Roman" w:cs="Times New Roman"/>
+            <w:rPrChange w:id="259" w:author="HP" w:date="2026-03-20T14:55:00Z">
+              <w:rPr/>
+            </w:rPrChange>
+          </w:rPr>
+          <w:t>Based on QCVN 41:2019/BGTVT.</w:t>
+        </w:r>
+        <w:r>
+          <w:rPr>
+            <w:rFonts w:ascii="Times New Roman" w:hAnsi="Times New Roman" w:cs="Times New Roman"/>
+            <w:rPrChange w:id="260" w:author="HP" w:date="2026-03-20T14:55:00Z">
+              <w:rPr/>
+            </w:rPrChange>
+          </w:rPr>
+          <w:br/>
+        </w:r>
+        <w:r>
+          <w:rPr>
+            <w:rFonts w:ascii="Times New Roman" w:hAnsi="Times New Roman" w:cs="Times New Roman"/>
+            <w:rPrChange w:id="261" w:author="HP" w:date="2026-03-20T14:55:00Z">
+              <w:rPr/>
+            </w:rPrChange>
+          </w:rPr>
+          <w:br/>
+          <w:t>Structure:</w:t>
+        </w:r>
+        <w:r>
+          <w:rPr>
+            <w:rFonts w:ascii="Times New Roman" w:hAnsi="Times New Roman" w:cs="Times New Roman"/>
+            <w:rPrChange w:id="262" w:author="HP" w:date="2026-03-20T14:55:00Z">
+              <w:rPr/>
+            </w:rPrChange>
+          </w:rPr>
+          <w:br/>
+          <w:t>- sign_code</w:t>
+        </w:r>
+        <w:r>
+          <w:rPr>
+            <w:rFonts w:ascii="Times New Roman" w:hAnsi="Times New Roman" w:cs="Times New Roman"/>
+            <w:rPrChange w:id="263" w:author="HP" w:date="2026-03-20T14:55:00Z">
+              <w:rPr/>
+            </w:rPrChange>
+          </w:rPr>
+          <w:br/>
+          <w:t>- sign_name</w:t>
+        </w:r>
+        <w:r>
+          <w:rPr>
+            <w:rFonts w:ascii="Times New Roman" w:hAnsi="Times New Roman" w:cs="Times New Roman"/>
+            <w:rPrChange w:id="264" w:author="HP" w:date="2026-03-20T14:55:00Z">
+              <w:rPr/>
+            </w:rPrChange>
+          </w:rPr>
+          <w:br/>
+          <w:t>- sign_type</w:t>
+        </w:r>
+        <w:r>
+          <w:rPr>
+            <w:rFonts w:ascii="Times New Roman" w:hAnsi="Times New Roman" w:cs="Times New Roman"/>
+            <w:rPrChange w:id="265" w:author="HP" w:date="2026-03-20T14:55:00Z">
+              <w:rPr/>
+            </w:rPrChange>
+          </w:rPr>
+          <w:br/>
+          <w:t>- description</w:t>
+        </w:r>
+        <w:r>
+          <w:rPr>
+            <w:rFonts w:ascii="Times New Roman" w:hAnsi="Times New Roman" w:cs="Times New Roman"/>
+            <w:rPrChange w:id="266" w:author="HP" w:date="2026-03-20T14:55:00Z">
+              <w:rPr/>
+            </w:rPrChange>
+          </w:rPr>
+          <w:br/>
+        </w:r>
+        <w:r>
+          <w:rPr>
+            <w:rFonts w:ascii="Times New Roman" w:hAnsi="Times New Roman" w:cs="Times New Roman"/>
+            <w:rPrChange w:id="267" w:author="HP" w:date="2026-03-20T14:55:00Z">
+              <w:rPr/>
+            </w:rPrChange>
+          </w:rPr>
+          <w:br/>
+          <w:t>Example:</w:t>
+        </w:r>
+        <w:r>
+          <w:rPr>
+            <w:rFonts w:ascii="Times New Roman" w:hAnsi="Times New Roman" w:cs="Times New Roman"/>
+            <w:rPrChange w:id="268" w:author="HP" w:date="2026-03-20T14:55:00Z">
+              <w:rPr/>
+            </w:rPrChange>
+          </w:rPr>
+          <w:br/>
+          <w:t>- P.124: No Left Turn</w:t>
+        </w:r>
+        <w:r>
+          <w:rPr>
+            <w:rFonts w:ascii="Times New Roman" w:hAnsi="Times New Roman" w:cs="Times New Roman"/>
+            <w:rPrChange w:id="269" w:author="HP" w:date="2026-03-20T14:55:00Z">
+              <w:rPr/>
+            </w:rPrChange>
+          </w:rPr>
+          <w:br/>
+          <w:t>- R.407: One-way road</w:t>
+        </w:r>
+        <w:r>
+          <w:rPr>
+            <w:rFonts w:ascii="Times New Roman" w:hAnsi="Times New Roman" w:cs="Times New Roman"/>
+            <w:rPrChange w:id="270" w:author="HP" w:date="2026-03-20T14:55:00Z">
+              <w:rPr/>
+            </w:rPrChange>
+          </w:rPr>
+          <w:br/>
+        </w:r>
+        <w:r>
+          <w:rPr>
+            <w:rFonts w:ascii="Times New Roman" w:hAnsi="Times New Roman" w:cs="Times New Roman"/>
+            <w:rPrChange w:id="271" w:author="HP" w:date="2026-03-20T14:55:00Z">
+              <w:rPr/>
+            </w:rPrChange>
+          </w:rPr>
+          <w:br/>
+          <w:t>Purpose:</w:t>
+        </w:r>
+        <w:r>
+          <w:rPr>
+            <w:rFonts w:ascii="Times New Roman" w:hAnsi="Times New Roman" w:cs="Times New Roman"/>
+            <w:rPrChange w:id="272" w:author="HP" w:date="2026-03-20T14:55:00Z">
+              <w:rPr/>
+            </w:rPrChange>
+          </w:rPr>
+          <w:br/>
+          <w:t>Supports recognition and explanation of traffic signs.</w:t>
+        </w:r>
+      </w:ins>
+    </w:p>
+    <w:p>
+      <w:pPr>
+        <w:rPr>
+          <w:ins w:id="273" w:author="HP" w:date="2026-03-19T10:39:00Z"/>
+          <w:rFonts w:ascii="Times New Roman" w:hAnsi="Times New Roman" w:cs="Times New Roman"/>
           <w:noProof/>
-        </w:rPr>
-        <w:pPrChange w:id="74" w:author="HP" w:date="2026-03-19T10:39:00Z">
+          <w:rPrChange w:id="274" w:author="HP" w:date="2026-03-20T14:55:00Z">
+            <w:rPr>
+              <w:ins w:id="275" w:author="HP" w:date="2026-03-19T10:39:00Z"/>
+              <w:noProof/>
+            </w:rPr>
+          </w:rPrChange>
+        </w:rPr>
+        <w:pPrChange w:id="276" w:author="HP" w:date="2026-03-19T10:39:00Z">
           <w:pPr>
             <w:jc w:val="center"/>
           </w:pPr>
@@ -1369,92 +2652,440 @@
     <w:p>
       <w:pPr>
         <w:rPr>
-          <w:ins w:id="75" w:author="HP" w:date="2026-03-19T10:39:00Z"/>
+          <w:ins w:id="277" w:author="HP" w:date="2026-03-20T14:48:00Z"/>
+          <w:rFonts w:ascii="Times New Roman" w:hAnsi="Times New Roman" w:cs="Times New Roman"/>
           <w:noProof/>
-        </w:rPr>
-        <w:pPrChange w:id="76" w:author="HP" w:date="2026-03-19T10:39:00Z">
+          <w:rPrChange w:id="278" w:author="HP" w:date="2026-03-20T14:55:00Z">
+            <w:rPr>
+              <w:ins w:id="279" w:author="HP" w:date="2026-03-20T14:48:00Z"/>
+              <w:noProof/>
+            </w:rPr>
+          </w:rPrChange>
+        </w:rPr>
+        <w:pPrChange w:id="280" w:author="HP" w:date="2026-03-19T10:39:00Z">
           <w:pPr>
             <w:jc w:val="center"/>
           </w:pPr>
         </w:pPrChange>
       </w:pPr>
-    </w:p>
-    <w:p>
-      <w:pPr>
-        <w:rPr>
-          <w:ins w:id="77" w:author="HP" w:date="2026-03-19T10:39:00Z"/>
+      <w:ins w:id="281" w:author="HP" w:date="2026-03-20T14:47:00Z">
+        <w:r>
+          <w:rPr>
+            <w:rFonts w:ascii="Times New Roman" w:hAnsi="Times New Roman" w:cs="Times New Roman"/>
+            <w:noProof/>
+            <w:rPrChange w:id="282" w:author="HP" w:date="2026-03-20T14:55:00Z">
+              <w:rPr>
+                <w:noProof/>
+              </w:rPr>
+            </w:rPrChange>
+          </w:rPr>
+          <w:t>2.2.4</w:t>
+        </w:r>
+      </w:ins>
+      <w:ins w:id="283" w:author="HP" w:date="2026-03-20T14:48:00Z">
+        <w:r>
+          <w:rPr>
+            <w:rFonts w:ascii="Times New Roman" w:hAnsi="Times New Roman" w:cs="Times New Roman"/>
+            <w:noProof/>
+            <w:rPrChange w:id="284" w:author="HP" w:date="2026-03-20T14:55:00Z">
+              <w:rPr>
+                <w:noProof/>
+              </w:rPr>
+            </w:rPrChange>
+          </w:rPr>
+          <w:t xml:space="preserve"> Driving Liences Dataset :</w:t>
+        </w:r>
+      </w:ins>
+    </w:p>
+    <w:p>
+      <w:pPr>
+        <w:rPr>
+          <w:ins w:id="285" w:author="HP" w:date="2026-03-19T10:39:00Z"/>
+          <w:rFonts w:ascii="Times New Roman" w:hAnsi="Times New Roman" w:cs="Times New Roman"/>
           <w:noProof/>
-        </w:rPr>
-        <w:pPrChange w:id="78" w:author="HP" w:date="2026-03-19T10:39:00Z">
+          <w:rPrChange w:id="286" w:author="HP" w:date="2026-03-20T14:55:00Z">
+            <w:rPr>
+              <w:ins w:id="287" w:author="HP" w:date="2026-03-19T10:39:00Z"/>
+              <w:noProof/>
+            </w:rPr>
+          </w:rPrChange>
+        </w:rPr>
+        <w:pPrChange w:id="288" w:author="HP" w:date="2026-03-19T10:39:00Z">
           <w:pPr>
             <w:jc w:val="center"/>
           </w:pPr>
         </w:pPrChange>
       </w:pPr>
-    </w:p>
-    <w:p>
-      <w:pPr>
-        <w:pStyle w:val="Heading1"/>
-        <w:rPr>
-          <w:ins w:id="79" w:author="HP" w:date="2026-03-19T10:40:00Z"/>
-          <w:noProof/>
-        </w:rPr>
-        <w:pPrChange w:id="80" w:author="HP" w:date="2026-03-19T10:40:00Z">
+      <w:ins w:id="289" w:author="HP" w:date="2026-03-20T14:48:00Z">
+        <w:r>
+          <w:rPr>
+            <w:rFonts w:ascii="Times New Roman" w:hAnsi="Times New Roman" w:cs="Times New Roman"/>
+            <w:rPrChange w:id="290" w:author="HP" w:date="2026-03-20T14:55:00Z">
+              <w:rPr/>
+            </w:rPrChange>
+          </w:rPr>
+          <w:t>Structure:</w:t>
+        </w:r>
+        <w:r>
+          <w:rPr>
+            <w:rFonts w:ascii="Times New Roman" w:hAnsi="Times New Roman" w:cs="Times New Roman"/>
+            <w:rPrChange w:id="291" w:author="HP" w:date="2026-03-20T14:55:00Z">
+              <w:rPr/>
+            </w:rPrChange>
+          </w:rPr>
+          <w:br/>
+          <w:t>- license_type</w:t>
+        </w:r>
+        <w:r>
+          <w:rPr>
+            <w:rFonts w:ascii="Times New Roman" w:hAnsi="Times New Roman" w:cs="Times New Roman"/>
+            <w:rPrChange w:id="292" w:author="HP" w:date="2026-03-20T14:55:00Z">
+              <w:rPr/>
+            </w:rPrChange>
+          </w:rPr>
+          <w:br/>
+          <w:t>- age_requirement</w:t>
+        </w:r>
+        <w:r>
+          <w:rPr>
+            <w:rFonts w:ascii="Times New Roman" w:hAnsi="Times New Roman" w:cs="Times New Roman"/>
+            <w:rPrChange w:id="293" w:author="HP" w:date="2026-03-20T14:55:00Z">
+              <w:rPr/>
+            </w:rPrChange>
+          </w:rPr>
+          <w:br/>
+          <w:t>- conditions</w:t>
+        </w:r>
+        <w:r>
+          <w:rPr>
+            <w:rFonts w:ascii="Times New Roman" w:hAnsi="Times New Roman" w:cs="Times New Roman"/>
+            <w:rPrChange w:id="294" w:author="HP" w:date="2026-03-20T14:55:00Z">
+              <w:rPr/>
+            </w:rPrChange>
+          </w:rPr>
+          <w:br/>
+        </w:r>
+        <w:r>
+          <w:rPr>
+            <w:rFonts w:ascii="Times New Roman" w:hAnsi="Times New Roman" w:cs="Times New Roman"/>
+            <w:rPrChange w:id="295" w:author="HP" w:date="2026-03-20T14:55:00Z">
+              <w:rPr/>
+            </w:rPrChange>
+          </w:rPr>
+          <w:br/>
+          <w:t>Example:</w:t>
+        </w:r>
+        <w:r>
+          <w:rPr>
+            <w:rFonts w:ascii="Times New Roman" w:hAnsi="Times New Roman" w:cs="Times New Roman"/>
+            <w:rPrChange w:id="296" w:author="HP" w:date="2026-03-20T14:55:00Z">
+              <w:rPr/>
+            </w:rPrChange>
+          </w:rPr>
+          <w:br/>
+          <w:t>- A1, A2, B1, B2</w:t>
+        </w:r>
+        <w:r>
+          <w:rPr>
+            <w:rFonts w:ascii="Times New Roman" w:hAnsi="Times New Roman" w:cs="Times New Roman"/>
+            <w:rPrChange w:id="297" w:author="HP" w:date="2026-03-20T14:55:00Z">
+              <w:rPr/>
+            </w:rPrChange>
+          </w:rPr>
+          <w:br/>
+        </w:r>
+        <w:r>
+          <w:rPr>
+            <w:rFonts w:ascii="Times New Roman" w:hAnsi="Times New Roman" w:cs="Times New Roman"/>
+            <w:rPrChange w:id="298" w:author="HP" w:date="2026-03-20T14:55:00Z">
+              <w:rPr/>
+            </w:rPrChange>
+          </w:rPr>
+          <w:br/>
+          <w:t>Purpose:</w:t>
+        </w:r>
+        <w:r>
+          <w:rPr>
+            <w:rFonts w:ascii="Times New Roman" w:hAnsi="Times New Roman" w:cs="Times New Roman"/>
+            <w:rPrChange w:id="299" w:author="HP" w:date="2026-03-20T14:55:00Z">
+              <w:rPr/>
+            </w:rPrChange>
+          </w:rPr>
+          <w:br/>
+          <w:t>Provides information about licensing requirements.</w:t>
+        </w:r>
+      </w:ins>
+    </w:p>
+    <w:p>
+      <w:pPr>
+        <w:rPr>
+          <w:ins w:id="300" w:author="HP" w:date="2026-03-20T14:54:00Z"/>
+          <w:rFonts w:ascii="Times New Roman" w:hAnsi="Times New Roman" w:cs="Times New Roman"/>
+          <w:rPrChange w:id="301" w:author="HP" w:date="2026-03-20T14:55:00Z">
+            <w:rPr>
+              <w:ins w:id="302" w:author="HP" w:date="2026-03-20T14:54:00Z"/>
+            </w:rPr>
+          </w:rPrChange>
+        </w:rPr>
+        <w:pPrChange w:id="303" w:author="HP" w:date="2026-03-19T10:39:00Z">
           <w:pPr>
             <w:jc w:val="center"/>
           </w:pPr>
         </w:pPrChange>
       </w:pPr>
-      <w:ins w:id="81" w:author="HP" w:date="2026-03-19T10:40:00Z">
-        <w:r>
-          <w:rPr>
+      <w:ins w:id="304" w:author="HP" w:date="2026-03-20T14:54:00Z">
+        <w:r>
+          <w:rPr>
+            <w:rFonts w:ascii="Times New Roman" w:hAnsi="Times New Roman" w:cs="Times New Roman"/>
             <w:noProof/>
-          </w:rPr>
-          <w:t>III Diagram – Flowchart</w:t>
-        </w:r>
-      </w:ins>
-    </w:p>
-    <w:p>
-      <w:pPr>
-        <w:pStyle w:val="Heading2"/>
-        <w:rPr>
-          <w:ins w:id="82" w:author="HP" w:date="2026-03-19T10:39:00Z"/>
+            <w:rPrChange w:id="305" w:author="HP" w:date="2026-03-20T14:55:00Z">
+              <w:rPr>
+                <w:noProof/>
+              </w:rPr>
+            </w:rPrChange>
+          </w:rPr>
+          <w:t xml:space="preserve">2.2.5 </w:t>
+        </w:r>
+        <w:r>
+          <w:rPr>
+            <w:rFonts w:ascii="Times New Roman" w:hAnsi="Times New Roman" w:cs="Times New Roman"/>
+            <w:rPrChange w:id="306" w:author="HP" w:date="2026-03-20T14:55:00Z">
+              <w:rPr/>
+            </w:rPrChange>
+          </w:rPr>
+          <w:t>Administrative Violation Law Dataset</w:t>
+        </w:r>
+        <w:r>
+          <w:rPr>
+            <w:rFonts w:ascii="Times New Roman" w:hAnsi="Times New Roman" w:cs="Times New Roman"/>
+            <w:rPrChange w:id="307" w:author="HP" w:date="2026-03-20T14:55:00Z">
+              <w:rPr/>
+            </w:rPrChange>
+          </w:rPr>
+          <w:t xml:space="preserve"> :</w:t>
+        </w:r>
+      </w:ins>
+    </w:p>
+    <w:p>
+      <w:pPr>
+        <w:rPr>
+          <w:ins w:id="308" w:author="HP" w:date="2026-03-19T10:39:00Z"/>
+          <w:rFonts w:ascii="Times New Roman" w:hAnsi="Times New Roman" w:cs="Times New Roman"/>
           <w:noProof/>
-        </w:rPr>
-        <w:pPrChange w:id="83" w:author="HP" w:date="2026-03-19T10:44:00Z">
+          <w:rPrChange w:id="309" w:author="HP" w:date="2026-03-20T14:55:00Z">
+            <w:rPr>
+              <w:ins w:id="310" w:author="HP" w:date="2026-03-19T10:39:00Z"/>
+              <w:noProof/>
+            </w:rPr>
+          </w:rPrChange>
+        </w:rPr>
+        <w:pPrChange w:id="311" w:author="HP" w:date="2026-03-19T10:39:00Z">
           <w:pPr>
             <w:jc w:val="center"/>
           </w:pPr>
         </w:pPrChange>
       </w:pPr>
-      <w:ins w:id="84" w:author="HP" w:date="2026-03-19T10:40:00Z">
-        <w:r>
-          <w:rPr>
-            <w:noProof/>
-          </w:rPr>
-          <w:t>3.1 UseCase</w:t>
-        </w:r>
-      </w:ins>
-    </w:p>
-    <w:p>
-      <w:pPr>
-        <w:rPr>
-          <w:ins w:id="85" w:author="HP" w:date="2026-03-19T10:44:00Z"/>
-        </w:rPr>
-        <w:pPrChange w:id="86" w:author="HP" w:date="2026-03-19T10:39:00Z">
+      <w:ins w:id="312" w:author="HP" w:date="2026-03-20T14:54:00Z">
+        <w:r>
+          <w:rPr>
+            <w:rFonts w:ascii="Times New Roman" w:hAnsi="Times New Roman" w:cs="Times New Roman"/>
+            <w:rPrChange w:id="313" w:author="HP" w:date="2026-03-20T14:55:00Z">
+              <w:rPr/>
+            </w:rPrChange>
+          </w:rPr>
+          <w:t>Based on the Law on Handling Administrative Violations 2012.</w:t>
+        </w:r>
+        <w:r>
+          <w:rPr>
+            <w:rFonts w:ascii="Times New Roman" w:hAnsi="Times New Roman" w:cs="Times New Roman"/>
+            <w:rPrChange w:id="314" w:author="HP" w:date="2026-03-20T14:55:00Z">
+              <w:rPr/>
+            </w:rPrChange>
+          </w:rPr>
+          <w:br/>
+        </w:r>
+        <w:r>
+          <w:rPr>
+            <w:rFonts w:ascii="Times New Roman" w:hAnsi="Times New Roman" w:cs="Times New Roman"/>
+            <w:rPrChange w:id="315" w:author="HP" w:date="2026-03-20T14:55:00Z">
+              <w:rPr/>
+            </w:rPrChange>
+          </w:rPr>
+          <w:br/>
+          <w:t>Structure:</w:t>
+        </w:r>
+        <w:r>
+          <w:rPr>
+            <w:rFonts w:ascii="Times New Roman" w:hAnsi="Times New Roman" w:cs="Times New Roman"/>
+            <w:rPrChange w:id="316" w:author="HP" w:date="2026-03-20T14:55:00Z">
+              <w:rPr/>
+            </w:rPrChange>
+          </w:rPr>
+          <w:br/>
+          <w:t>- penalty_procedure</w:t>
+        </w:r>
+        <w:r>
+          <w:rPr>
+            <w:rFonts w:ascii="Times New Roman" w:hAnsi="Times New Roman" w:cs="Times New Roman"/>
+            <w:rPrChange w:id="317" w:author="HP" w:date="2026-03-20T14:55:00Z">
+              <w:rPr/>
+            </w:rPrChange>
+          </w:rPr>
+          <w:br/>
+          <w:t>- authority</w:t>
+        </w:r>
+        <w:r>
+          <w:rPr>
+            <w:rFonts w:ascii="Times New Roman" w:hAnsi="Times New Roman" w:cs="Times New Roman"/>
+            <w:rPrChange w:id="318" w:author="HP" w:date="2026-03-20T14:55:00Z">
+              <w:rPr/>
+            </w:rPrChange>
+          </w:rPr>
+          <w:br/>
+          <w:t>- deadline</w:t>
+        </w:r>
+        <w:r>
+          <w:rPr>
+            <w:rFonts w:ascii="Times New Roman" w:hAnsi="Times New Roman" w:cs="Times New Roman"/>
+            <w:rPrChange w:id="319" w:author="HP" w:date="2026-03-20T14:55:00Z">
+              <w:rPr/>
+            </w:rPrChange>
+          </w:rPr>
+          <w:br/>
+        </w:r>
+        <w:r>
+          <w:rPr>
+            <w:rFonts w:ascii="Times New Roman" w:hAnsi="Times New Roman" w:cs="Times New Roman"/>
+            <w:rPrChange w:id="320" w:author="HP" w:date="2026-03-20T14:55:00Z">
+              <w:rPr/>
+            </w:rPrChange>
+          </w:rPr>
+          <w:br/>
+          <w:t>Purpose:</w:t>
+        </w:r>
+        <w:r>
+          <w:rPr>
+            <w:rFonts w:ascii="Times New Roman" w:hAnsi="Times New Roman" w:cs="Times New Roman"/>
+            <w:rPrChange w:id="321" w:author="HP" w:date="2026-03-20T14:55:00Z">
+              <w:rPr/>
+            </w:rPrChange>
+          </w:rPr>
+          <w:br/>
+          <w:t>Explains legal procedures and enforcement authority.</w:t>
+        </w:r>
+      </w:ins>
+    </w:p>
+    <w:p>
+      <w:pPr>
+        <w:pStyle w:val="Heading1"/>
+        <w:rPr>
+          <w:ins w:id="322" w:author="HP" w:date="2026-03-19T10:40:00Z"/>
+          <w:rFonts w:ascii="Times New Roman" w:hAnsi="Times New Roman" w:cs="Times New Roman"/>
+          <w:noProof/>
+          <w:sz w:val="24"/>
+          <w:szCs w:val="24"/>
+          <w:rPrChange w:id="323" w:author="HP" w:date="2026-03-20T14:55:00Z">
+            <w:rPr>
+              <w:ins w:id="324" w:author="HP" w:date="2026-03-19T10:40:00Z"/>
+              <w:noProof/>
+            </w:rPr>
+          </w:rPrChange>
+        </w:rPr>
+        <w:pPrChange w:id="325" w:author="HP" w:date="2026-03-19T10:40:00Z">
           <w:pPr>
             <w:jc w:val="center"/>
           </w:pPr>
         </w:pPrChange>
       </w:pPr>
-      <w:moveToRangeStart w:id="87" w:author="HP" w:date="2026-03-19T10:40:00Z" w:name="move224809236"/>
-      <w:moveTo w:id="88" w:author="HP" w:date="2026-03-19T10:40:00Z">
-        <w:r>
-          <w:rPr>
+      <w:ins w:id="326" w:author="HP" w:date="2026-03-19T10:40:00Z">
+        <w:r>
+          <w:rPr>
+            <w:rFonts w:ascii="Times New Roman" w:hAnsi="Times New Roman" w:cs="Times New Roman"/>
             <w:noProof/>
+            <w:sz w:val="24"/>
+            <w:szCs w:val="24"/>
+            <w:rPrChange w:id="327" w:author="HP" w:date="2026-03-20T14:55:00Z">
+              <w:rPr>
+                <w:noProof/>
+              </w:rPr>
+            </w:rPrChange>
+          </w:rPr>
+          <w:lastRenderedPageBreak/>
+          <w:t>III Diagram – Flowchart</w:t>
+        </w:r>
+      </w:ins>
+    </w:p>
+    <w:p>
+      <w:pPr>
+        <w:pStyle w:val="Heading2"/>
+        <w:rPr>
+          <w:ins w:id="328" w:author="HP" w:date="2026-03-19T10:39:00Z"/>
+          <w:rFonts w:ascii="Times New Roman" w:hAnsi="Times New Roman" w:cs="Times New Roman"/>
+          <w:noProof/>
+          <w:sz w:val="24"/>
+          <w:szCs w:val="24"/>
+          <w:rPrChange w:id="329" w:author="HP" w:date="2026-03-20T14:55:00Z">
+            <w:rPr>
+              <w:ins w:id="330" w:author="HP" w:date="2026-03-19T10:39:00Z"/>
+              <w:noProof/>
+            </w:rPr>
+          </w:rPrChange>
+        </w:rPr>
+        <w:pPrChange w:id="331" w:author="HP" w:date="2026-03-19T10:44:00Z">
+          <w:pPr>
+            <w:jc w:val="center"/>
+          </w:pPr>
+        </w:pPrChange>
+      </w:pPr>
+      <w:ins w:id="332" w:author="HP" w:date="2026-03-19T10:40:00Z">
+        <w:r>
+          <w:rPr>
+            <w:rFonts w:ascii="Times New Roman" w:hAnsi="Times New Roman" w:cs="Times New Roman"/>
+            <w:noProof/>
+            <w:sz w:val="24"/>
+            <w:szCs w:val="24"/>
+            <w:rPrChange w:id="333" w:author="HP" w:date="2026-03-20T14:55:00Z">
+              <w:rPr>
+                <w:noProof/>
+              </w:rPr>
+            </w:rPrChange>
+          </w:rPr>
+          <w:t>3.1 UseCase</w:t>
+        </w:r>
+      </w:ins>
+    </w:p>
+    <w:p>
+      <w:pPr>
+        <w:rPr>
+          <w:ins w:id="334" w:author="HP" w:date="2026-03-19T10:44:00Z"/>
+          <w:rFonts w:ascii="Times New Roman" w:hAnsi="Times New Roman" w:cs="Times New Roman"/>
+          <w:rPrChange w:id="335" w:author="HP" w:date="2026-03-20T14:55:00Z">
+            <w:rPr>
+              <w:ins w:id="336" w:author="HP" w:date="2026-03-19T10:44:00Z"/>
+            </w:rPr>
+          </w:rPrChange>
+        </w:rPr>
+        <w:pPrChange w:id="337" w:author="HP" w:date="2026-03-19T10:39:00Z">
+          <w:pPr>
+            <w:jc w:val="center"/>
+          </w:pPr>
+        </w:pPrChange>
+      </w:pPr>
+      <w:bookmarkStart w:id="338" w:name="_GoBack"/>
+      <w:moveToRangeStart w:id="339" w:author="HP" w:date="2026-03-19T10:40:00Z" w:name="move224809236"/>
+      <w:moveTo w:id="340" w:author="HP" w:date="2026-03-19T10:40:00Z">
+        <w:r>
+          <w:rPr>
+            <w:rFonts w:ascii="Times New Roman" w:hAnsi="Times New Roman" w:cs="Times New Roman"/>
+            <w:noProof/>
+            <w:rPrChange w:id="341" w:author="HP" w:date="2026-03-20T14:55:00Z">
+              <w:rPr>
+                <w:noProof/>
+              </w:rPr>
+            </w:rPrChange>
           </w:rPr>
           <w:drawing>
-            <wp:inline distT="0" distB="0" distL="0" distR="0" wp14:anchorId="0A3C6413" wp14:editId="49D7E373">
+            <wp:inline distT="0" distB="0" distL="0" distR="0" wp14:anchorId="418EAE2C" wp14:editId="19BC959E">
               <wp:extent cx="4889500" cy="3409056"/>
               <wp:effectExtent l="0" t="0" r="6350" b="1270"/>
               <wp:docPr id="3" name="Picture 3" descr="C:\Users\HP\Downloads\UseCaseAI.png"/>
@@ -1503,22 +3134,39 @@
           </w:drawing>
         </w:r>
       </w:moveTo>
-      <w:moveToRangeEnd w:id="87"/>
+      <w:bookmarkEnd w:id="338"/>
+      <w:moveToRangeEnd w:id="339"/>
     </w:p>
     <w:p>
       <w:pPr>
         <w:pStyle w:val="Heading2"/>
         <w:rPr>
-          <w:ins w:id="89" w:author="HP" w:date="2026-03-19T10:44:00Z"/>
-        </w:rPr>
-        <w:pPrChange w:id="90" w:author="HP" w:date="2026-03-19T10:47:00Z">
+          <w:ins w:id="342" w:author="HP" w:date="2026-03-19T10:44:00Z"/>
+          <w:rFonts w:ascii="Times New Roman" w:hAnsi="Times New Roman" w:cs="Times New Roman"/>
+          <w:sz w:val="24"/>
+          <w:szCs w:val="24"/>
+          <w:rPrChange w:id="343" w:author="HP" w:date="2026-03-20T14:55:00Z">
+            <w:rPr>
+              <w:ins w:id="344" w:author="HP" w:date="2026-03-19T10:44:00Z"/>
+            </w:rPr>
+          </w:rPrChange>
+        </w:rPr>
+        <w:pPrChange w:id="345" w:author="HP" w:date="2026-03-19T10:47:00Z">
           <w:pPr>
             <w:jc w:val="center"/>
           </w:pPr>
         </w:pPrChange>
       </w:pPr>
-      <w:ins w:id="91" w:author="HP" w:date="2026-03-19T10:44:00Z">
-        <w:r>
+      <w:ins w:id="346" w:author="HP" w:date="2026-03-19T10:44:00Z">
+        <w:r>
+          <w:rPr>
+            <w:rFonts w:ascii="Times New Roman" w:hAnsi="Times New Roman" w:cs="Times New Roman"/>
+            <w:sz w:val="24"/>
+            <w:szCs w:val="24"/>
+            <w:rPrChange w:id="347" w:author="HP" w:date="2026-03-20T14:55:00Z">
+              <w:rPr/>
+            </w:rPrChange>
+          </w:rPr>
           <w:t>3.2 . Activity of Chatbot System</w:t>
         </w:r>
       </w:ins>
@@ -1526,9 +3174,15 @@
     <w:p>
       <w:pPr>
         <w:rPr>
-          <w:ins w:id="92" w:author="HP" w:date="2026-03-19T10:47:00Z"/>
-        </w:rPr>
-        <w:pPrChange w:id="93" w:author="HP" w:date="2026-03-19T10:39:00Z">
+          <w:ins w:id="348" w:author="HP" w:date="2026-03-19T10:47:00Z"/>
+          <w:rFonts w:ascii="Times New Roman" w:hAnsi="Times New Roman" w:cs="Times New Roman"/>
+          <w:rPrChange w:id="349" w:author="HP" w:date="2026-03-20T14:55:00Z">
+            <w:rPr>
+              <w:ins w:id="350" w:author="HP" w:date="2026-03-19T10:47:00Z"/>
+            </w:rPr>
+          </w:rPrChange>
+        </w:rPr>
+        <w:pPrChange w:id="351" w:author="HP" w:date="2026-03-19T10:39:00Z">
           <w:pPr>
             <w:jc w:val="center"/>
           </w:pPr>
@@ -1536,10 +3190,16 @@
       </w:pPr>
       <w:r>
         <w:rPr>
+          <w:rFonts w:ascii="Times New Roman" w:hAnsi="Times New Roman" w:cs="Times New Roman"/>
           <w:noProof/>
+          <w:rPrChange w:id="352" w:author="HP" w:date="2026-03-20T14:55:00Z">
+            <w:rPr>
+              <w:noProof/>
+            </w:rPr>
+          </w:rPrChange>
         </w:rPr>
         <w:drawing>
-          <wp:inline distT="0" distB="0" distL="0" distR="0" wp14:anchorId="5AD975E6" wp14:editId="638CE832">
+          <wp:inline distT="0" distB="0" distL="0" distR="0" wp14:anchorId="72C49ABF" wp14:editId="7B71951B">
             <wp:extent cx="4806950" cy="3247485"/>
             <wp:effectExtent l="0" t="0" r="0" b="0"/>
             <wp:docPr id="2" name="Picture 2" descr="C:\Users\HP\Downloads\FlowChartAI.png"/>
@@ -1590,7 +3250,13 @@
     </w:p>
     <w:p>
       <w:pPr>
-        <w:pPrChange w:id="94" w:author="HP" w:date="2026-03-19T10:39:00Z">
+        <w:rPr>
+          <w:rFonts w:ascii="Times New Roman" w:hAnsi="Times New Roman" w:cs="Times New Roman"/>
+          <w:rPrChange w:id="353" w:author="HP" w:date="2026-03-20T14:55:00Z">
+            <w:rPr/>
+          </w:rPrChange>
+        </w:rPr>
+        <w:pPrChange w:id="354" w:author="HP" w:date="2026-03-19T10:39:00Z">
           <w:pPr>
             <w:jc w:val="center"/>
           </w:pPr>
@@ -1601,16 +3267,32 @@
       <w:pPr>
         <w:pStyle w:val="Heading2"/>
         <w:rPr>
-          <w:ins w:id="95" w:author="HP" w:date="2026-03-19T10:47:00Z"/>
-        </w:rPr>
-        <w:pPrChange w:id="96" w:author="HP" w:date="2026-03-19T10:47:00Z">
+          <w:ins w:id="355" w:author="HP" w:date="2026-03-19T10:47:00Z"/>
+          <w:rFonts w:ascii="Times New Roman" w:hAnsi="Times New Roman" w:cs="Times New Roman"/>
+          <w:sz w:val="24"/>
+          <w:szCs w:val="24"/>
+          <w:rPrChange w:id="356" w:author="HP" w:date="2026-03-20T14:55:00Z">
+            <w:rPr>
+              <w:ins w:id="357" w:author="HP" w:date="2026-03-19T10:47:00Z"/>
+            </w:rPr>
+          </w:rPrChange>
+        </w:rPr>
+        <w:pPrChange w:id="358" w:author="HP" w:date="2026-03-19T10:47:00Z">
           <w:pPr>
             <w:jc w:val="center"/>
           </w:pPr>
         </w:pPrChange>
       </w:pPr>
-      <w:ins w:id="97" w:author="HP" w:date="2026-03-19T10:44:00Z">
-        <w:r>
+      <w:ins w:id="359" w:author="HP" w:date="2026-03-19T10:44:00Z">
+        <w:r>
+          <w:rPr>
+            <w:rFonts w:ascii="Times New Roman" w:hAnsi="Times New Roman" w:cs="Times New Roman"/>
+            <w:sz w:val="24"/>
+            <w:szCs w:val="24"/>
+            <w:rPrChange w:id="360" w:author="HP" w:date="2026-03-20T14:55:00Z">
+              <w:rPr/>
+            </w:rPrChange>
+          </w:rPr>
           <w:lastRenderedPageBreak/>
           <w:t xml:space="preserve">3.3 Architechure </w:t>
         </w:r>
@@ -1618,19 +3300,31 @@
     </w:p>
     <w:p>
       <w:pPr>
-        <w:pPrChange w:id="98" w:author="HP" w:date="2026-03-19T10:44:00Z">
+        <w:rPr>
+          <w:rFonts w:ascii="Times New Roman" w:hAnsi="Times New Roman" w:cs="Times New Roman"/>
+          <w:rPrChange w:id="361" w:author="HP" w:date="2026-03-20T14:55:00Z">
+            <w:rPr/>
+          </w:rPrChange>
+        </w:rPr>
+        <w:pPrChange w:id="362" w:author="HP" w:date="2026-03-19T10:44:00Z">
           <w:pPr>
             <w:jc w:val="center"/>
           </w:pPr>
         </w:pPrChange>
       </w:pPr>
-      <w:ins w:id="99" w:author="HP" w:date="2026-03-19T10:47:00Z">
-        <w:r>
-          <w:rPr>
+      <w:ins w:id="363" w:author="HP" w:date="2026-03-19T10:47:00Z">
+        <w:r>
+          <w:rPr>
+            <w:rFonts w:ascii="Times New Roman" w:hAnsi="Times New Roman" w:cs="Times New Roman"/>
             <w:noProof/>
+            <w:rPrChange w:id="364" w:author="HP" w:date="2026-03-20T14:55:00Z">
+              <w:rPr>
+                <w:noProof/>
+              </w:rPr>
+            </w:rPrChange>
           </w:rPr>
           <w:drawing>
-            <wp:inline distT="0" distB="0" distL="0" distR="0" wp14:anchorId="737B747C" wp14:editId="35BFA531">
+            <wp:inline distT="0" distB="0" distL="0" distR="0" wp14:anchorId="4F723999" wp14:editId="6C18881C">
               <wp:extent cx="5943600" cy="3121660"/>
               <wp:effectExtent l="0" t="0" r="0" b="2540"/>
               <wp:docPr id="4" name="Picture 4"/>
@@ -1666,17 +3360,29 @@
           </w:drawing>
         </w:r>
         <w:r>
+          <w:rPr>
+            <w:rFonts w:ascii="Times New Roman" w:hAnsi="Times New Roman" w:cs="Times New Roman"/>
+            <w:rPrChange w:id="365" w:author="HP" w:date="2026-03-20T14:55:00Z">
+              <w:rPr/>
+            </w:rPrChange>
+          </w:rPr>
           <w:t xml:space="preserve"> </w:t>
         </w:r>
       </w:ins>
-      <w:moveFromRangeStart w:id="100" w:author="HP" w:date="2026-03-19T10:40:00Z" w:name="move224809236"/>
-      <w:moveFrom w:id="101" w:author="HP" w:date="2026-03-19T10:40:00Z">
-        <w:r>
-          <w:rPr>
+      <w:moveFromRangeStart w:id="366" w:author="HP" w:date="2026-03-19T10:40:00Z" w:name="move224809236"/>
+      <w:moveFrom w:id="367" w:author="HP" w:date="2026-03-19T10:40:00Z">
+        <w:r>
+          <w:rPr>
+            <w:rFonts w:ascii="Times New Roman" w:hAnsi="Times New Roman" w:cs="Times New Roman"/>
             <w:noProof/>
+            <w:rPrChange w:id="368" w:author="HP" w:date="2026-03-20T14:55:00Z">
+              <w:rPr>
+                <w:noProof/>
+              </w:rPr>
+            </w:rPrChange>
           </w:rPr>
           <w:drawing>
-            <wp:inline distT="0" distB="0" distL="0" distR="0" wp14:anchorId="3C54AB12" wp14:editId="17339D38">
+            <wp:inline distT="0" distB="0" distL="0" distR="0" wp14:anchorId="042A78BC" wp14:editId="6C6680C3">
               <wp:extent cx="4889500" cy="3409056"/>
               <wp:effectExtent l="0" t="0" r="6350" b="1270"/>
               <wp:docPr id="1" name="Picture 1" descr="C:\Users\HP\Downloads\UseCaseAI.png"/>
@@ -1725,7 +3431,7 @@
           </w:drawing>
         </w:r>
       </w:moveFrom>
-      <w:moveFromRangeEnd w:id="100"/>
+      <w:moveFromRangeEnd w:id="366"/>
     </w:p>
     <w:sectPr>
       <w:pgSz w:w="12240" w:h="15840"/>
@@ -2598,7 +4304,7 @@
 </file>
 
 <file path=customXml/itemProps1.xml><?xml version="1.0" encoding="utf-8"?>
-<ds:datastoreItem xmlns:ds="http://schemas.openxmlformats.org/officeDocument/2006/customXml" ds:itemID="{D29C187E-9A92-4E39-90D2-1642B59A02BC}">
+<ds:datastoreItem xmlns:ds="http://schemas.openxmlformats.org/officeDocument/2006/customXml" ds:itemID="{B9558007-3A8B-48CD-8153-2F78DC92723D}">
   <ds:schemaRefs>
     <ds:schemaRef ds:uri="http://schemas.openxmlformats.org/officeDocument/2006/bibliography"/>
   </ds:schemaRefs>

</xml_diff>